<commit_message>
update main with seasonal analysis
</commit_message>
<xml_diff>
--- a/article/main-article/article.docx
+++ b/article/main-article/article.docx
@@ -39,7 +39,7 @@
         <w:pStyle w:val="Date"/>
       </w:pPr>
       <w:r>
-        <w:t xml:space="preserve">2026-05-04</w:t>
+        <w:t xml:space="preserve">2026-07-24</w:t>
       </w:r>
     </w:p>
     <w:p>
@@ -175,21 +175,24 @@
         <w:t xml:space="preserve">(Cai et al. 2022; Reeder, Spengler, and Musgrave 2015)</w:t>
       </w:r>
       <w:r>
-        <w:t xml:space="preserve">, and can successfully identify cold fronts in data with different resolutions, including both station data and reanalyses (</w:t>
+        <w:t xml:space="preserve">, and can successfully identify cold fronts in data with different resolutions, including both station data and reanalyses</w:t>
+      </w:r>
+      <w:r>
+        <w:t xml:space="preserve"> </w:t>
+      </w:r>
+      <w:r>
+        <w:t xml:space="preserve">(King, Reeder, and Jakob 2024)</w:t>
+      </w:r>
+      <w:r>
+        <w:t xml:space="preserve">. Indeed,</w:t>
+      </w:r>
+      <w:r>
+        <w:t xml:space="preserve"> </w:t>
       </w:r>
       <w:r>
         <w:t xml:space="preserve">King, Reeder, and Jakob (2024)</w:t>
       </w:r>
       <w:r>
-        <w:t xml:space="preserve">). Indeed,</w:t>
-      </w:r>
-      <w:r>
-        <w:t xml:space="preserve"> </w:t>
-      </w:r>
-      <w:r>
-        <w:t xml:space="preserve">King, Reeder, and Jakob (2024)</w:t>
-      </w:r>
-      <w:r>
         <w:t xml:space="preserve"> </w:t>
       </w:r>
       <w:r>
@@ -253,7 +256,19 @@
         <w:t xml:space="preserve"> </w:t>
       </w:r>
       <w:r>
-        <w:t xml:space="preserve">This approach offers several advantages. First, the method’s simplicity and resolution-independence allows us to compare it with earlier studies using other methodologies. Second, focusing on local temperature falls provides a complementary perspective to Lagrangian approaches, as day-to-day temperature falls are the most direct impact of cold fronts on local weather.</w:t>
+        <w:t xml:space="preserve">This approach offers several advantages. First, the method’s simplicity and weak resolution-dependence</w:t>
+      </w:r>
+      <w:r>
+        <w:t xml:space="preserve"> </w:t>
+      </w:r>
+      <w:r>
+        <w:t xml:space="preserve">(as shown by King, Reeder, and Jakob 2024)</w:t>
+      </w:r>
+      <w:r>
+        <w:t xml:space="preserve"> </w:t>
+      </w:r>
+      <w:r>
+        <w:t xml:space="preserve">allows us to compare it with earlier studies using other methodologies. Second, focusing on local temperature falls provides a complementary perspective to Lagrangian approaches, as day-to-day temperature falls are the most direct impact of cold fronts on local weather.</w:t>
       </w:r>
     </w:p>
     <w:p>
@@ -270,7 +285,7 @@
         <w:t xml:space="preserve">Catto et al. (2014)</w:t>
       </w:r>
       <w:r>
-        <w:t xml:space="preserve">, we find a decrease in cold front frequency in the northern hemisphere and a poleward shift in the Southern Hemisphere. Seeking to develop a physical explanation for these changes, we first studied the response of the meridional temperature gradient and it relationship with the change in front frequency. We also explored the relationship between changes in front frequency and transient eddy kinetic energy, as it is directly related to the storm tracks. Several studies have shown a poleward shift on the storm tracks in future climate change scenarios, particularly in the Southern Hemisphere</w:t>
+        <w:t xml:space="preserve">, we find a decrease in cold front frequency in the Northern Hemisphere and a poleward shift in the Southern Hemisphere. Seeking to develop a physical explanation for these changes, we first study the response of the meridional temperature gradient and its relationship with the change in front frequency. We also explore the relationship between changes in front frequency and transient eddy kinetic energy, as it is directly related to the storm tracks. Several studies have shown a poleward shift on the storm tracks in future climate change scenarios, particularly in the Southern Hemisphere</w:t>
       </w:r>
       <w:r>
         <w:t xml:space="preserve"> </w:t>
@@ -1165,7 +1180,7 @@
         <w:pStyle w:val="FirstParagraph"/>
       </w:pPr>
       <w:r>
-        <w:t xml:space="preserve">We identify falls in surface air temperature as a proxy for frontal passages by calculating the change in daily maximum temperature from one day to the next (</w:t>
+        <w:t xml:space="preserve">We identify falls in near-surface air temperature (2 meter) as a proxy for frontal passages by calculating the change in daily maximum temperature from one day to the next (</w:t>
       </w:r>
       <m:oMath>
         <m:r>
@@ -1297,7 +1312,30 @@
         </m:r>
       </m:oMath>
       <w:r>
-        <w:t xml:space="preserve">. While this value is reasonable for detecting strong falls in temperature over land, it may underestimate the frequency of fronts over the ocean due to the smaller temperature variability. For this reason, in this study, we use the value of the 2.5th percentile of</w:t>
+        <w:t xml:space="preserve">. While this value is reasonable for detecting strong falls in temperature over land, it may underestimate the frequency of fronts over the ocean due to the smaller temperature variability. For this reason, in this study, we use the value of the 2.5</w:t>
+      </w:r>
+      <m:oMath>
+        <m:sSup>
+          <m:e>
+            <m:r>
+              <m:t>​</m:t>
+            </m:r>
+          </m:e>
+          <m:sup>
+            <m:r>
+              <m:t>t</m:t>
+            </m:r>
+            <m:r>
+              <m:t>h</m:t>
+            </m:r>
+          </m:sup>
+        </m:sSup>
+      </m:oMath>
+      <w:r>
+        <w:t xml:space="preserve"> </w:t>
+      </w:r>
+      <w:r>
+        <w:t xml:space="preserve">percentile of</w:t>
       </w:r>
       <w:r>
         <w:t xml:space="preserve"> </w:t>
@@ -1373,7 +1411,30 @@
         <w:t xml:space="preserve"> </w:t>
       </w:r>
       <w:r>
-        <w:t xml:space="preserve">percentile. This percentile is chosen because the mean of the 2.5th percentile over all midlatitude land areas (between 25</w:t>
+        <w:t xml:space="preserve">percentile. This percentile is chosen because the mean of the 2.5</w:t>
+      </w:r>
+      <m:oMath>
+        <m:sSup>
+          <m:e>
+            <m:r>
+              <m:t>​</m:t>
+            </m:r>
+          </m:e>
+          <m:sup>
+            <m:r>
+              <m:t>t</m:t>
+            </m:r>
+            <m:r>
+              <m:t>h</m:t>
+            </m:r>
+          </m:sup>
+        </m:sSup>
+      </m:oMath>
+      <w:r>
+        <w:t xml:space="preserve"> </w:t>
+      </w:r>
+      <w:r>
+        <w:t xml:space="preserve">percentile over all midlatitude land areas (between 25</w:t>
       </w:r>
       <m:oMath>
         <m:sSup>
@@ -1457,7 +1518,38 @@
         <w:t xml:space="preserve">King, Reeder, and Jakob (2024)</w:t>
       </w:r>
       <w:r>
-        <w:t xml:space="preserve">. The percentiles are calculated over the historical period between 1979 and 2014 for each model at each grid point. It is important to note that by using this threshold we detect frontal passages in exactly 2.5% of days. In regions of regular frontal passage the 2.5th percentile of</w:t>
+        <w:t xml:space="preserve">. The percentiles are calculated over the historical period between 1979 and 2014 for each model at each grid point. Additionally, the percentile values are also calculated over the same period for December-January-February (DJF) and June-July-August (JJA) for the seasonal analysis (see Supplemental Information).</w:t>
+      </w:r>
+    </w:p>
+    <w:p>
+      <w:pPr>
+        <w:pStyle w:val="BodyText"/>
+      </w:pPr>
+      <w:r>
+        <w:t xml:space="preserve">It is important to note that by using this threshold we detect frontal passages in exactly 2.5% of days. In regions of regular frontal passage the 2.5</w:t>
+      </w:r>
+      <m:oMath>
+        <m:sSup>
+          <m:e>
+            <m:r>
+              <m:t>​</m:t>
+            </m:r>
+          </m:e>
+          <m:sup>
+            <m:r>
+              <m:t>t</m:t>
+            </m:r>
+            <m:r>
+              <m:t>h</m:t>
+            </m:r>
+          </m:sup>
+        </m:sSup>
+      </m:oMath>
+      <w:r>
+        <w:t xml:space="preserve"> </w:t>
+      </w:r>
+      <w:r>
+        <w:t xml:space="preserve">percentile of</w:t>
       </w:r>
       <w:r>
         <w:t xml:space="preserve"> </w:t>
@@ -1688,7 +1780,7 @@
         <w:t xml:space="preserve"> </w:t>
       </w:r>
       <w:r>
-        <w:t xml:space="preserve">and use the band-pass filtered transient eddy kinetic energy (EKE) in the upper troposphere. For each model, we calculated the EKE as</w:t>
+        <w:t xml:space="preserve">and use the high-pass filtered transient eddy kinetic energy (EKE) in the upper troposphere. For each model, we calculated the EKE as</w:t>
       </w:r>
       <w:r>
         <w:t xml:space="preserve"> </w:t>
@@ -1983,7 +2075,98 @@
         <w:t xml:space="preserve"> </w:t>
       </w:r>
       <w:r>
-        <w:t xml:space="preserve">frequency for each latitude over sea and over land respectively. In the Northern Hemisphere over land, there is a robust decrease in</w:t>
+        <w:t xml:space="preserve">frequency for each latitude over sea and over land respectively.</w:t>
+      </w:r>
+    </w:p>
+    <w:p>
+      <w:pPr>
+        <w:pStyle w:val="BodyText"/>
+      </w:pPr>
+      <w:hyperlink w:anchor="fig-trend">
+        <w:r>
+          <w:rPr>
+            <w:rStyle w:val="Hyperlink"/>
+          </w:rPr>
+          <w:t xml:space="preserve">Figure 1</w:t>
+        </w:r>
+      </w:hyperlink>
+      <w:r>
+        <w:t xml:space="preserve"> </w:t>
+      </w:r>
+      <w:r>
+        <w:t xml:space="preserve">d) show the</w:t>
+      </w:r>
+      <w:r>
+        <w:t xml:space="preserve"> </w:t>
+      </w:r>
+      <m:oMath>
+        <m:r>
+          <m:t>Δ</m:t>
+        </m:r>
+        <m:r>
+          <m:t>T</m:t>
+        </m:r>
+      </m:oMath>
+      <w:r>
+        <w:t xml:space="preserve"> </w:t>
+      </w:r>
+      <w:r>
+        <w:t xml:space="preserve">values associated with the 2.5</w:t>
+      </w:r>
+      <m:oMath>
+        <m:sSup>
+          <m:e>
+            <m:r>
+              <m:t>​</m:t>
+            </m:r>
+          </m:e>
+          <m:sup>
+            <m:r>
+              <m:t>t</m:t>
+            </m:r>
+            <m:r>
+              <m:t>h</m:t>
+            </m:r>
+          </m:sup>
+        </m:sSup>
+      </m:oMath>
+      <w:r>
+        <w:t xml:space="preserve"> </w:t>
+      </w:r>
+      <w:r>
+        <w:t xml:space="preserve">percentile. We found that the spatial pattern correlates with the climatology of cold fronts proposed by</w:t>
+      </w:r>
+      <w:r>
+        <w:t xml:space="preserve"> </w:t>
+      </w:r>
+      <w:r>
+        <w:t xml:space="preserve">Berry, Reeder, and Jakob (2011)</w:t>
+      </w:r>
+      <w:r>
+        <w:t xml:space="preserve"> </w:t>
+      </w:r>
+      <w:r>
+        <w:t xml:space="preserve">(their Figure 2a) or</w:t>
+      </w:r>
+      <w:r>
+        <w:t xml:space="preserve"> </w:t>
+      </w:r>
+      <w:r>
+        <w:t xml:space="preserve">King, Reeder, and Jakob (2024)</w:t>
+      </w:r>
+      <w:r>
+        <w:t xml:space="preserve"> </w:t>
+      </w:r>
+      <w:r>
+        <w:t xml:space="preserve">(their Figure 6). This shows that temperature drops from one day to the next identified using this percentile are directly related to cold front passages.</w:t>
+      </w:r>
+    </w:p>
+    <w:p>
+      <w:pPr>
+        <w:pStyle w:val="BodyText"/>
+      </w:pPr>
+      <w:r>
+        <w:t xml:space="preserve">In terms of projected changes, in the Northern Hemisphere over land, there is a robust decrease in</w:t>
       </w:r>
       <w:r>
         <w:t xml:space="preserve"> </w:t>
@@ -2141,49 +2324,58 @@
         <w:t xml:space="preserve"> </w:t>
       </w:r>
       <w:r>
-        <w:t xml:space="preserve">This pattern indicates that the areas of higher front frequency shift poleward in the future scenario. In the Indian ocean, the pattern in more complicated, with a second band of increased frequency in the subtropics most pronounced in the Agulas region. The oceanic regions in the Southern Hemisphere are also associated with an increase in</w:t>
+        <w:t xml:space="preserve">This pattern indicates that the areas of higher front frequency shift poleward in the future scenario. In the Indian ocean, the pattern in more complicated, with a second band of increased frequency in the subtropics most pronounced in the Agulas region.</w:t>
+      </w:r>
+    </w:p>
+    <w:p>
+      <w:pPr>
+        <w:pStyle w:val="BodyText"/>
+      </w:pPr>
+      <w:r>
+        <w:t xml:space="preserve">The analysis of the change in frequency of</w:t>
       </w:r>
       <w:r>
         <w:t xml:space="preserve"> </w:t>
       </w:r>
       <m:oMath>
         <m:r>
-          <m:rPr>
-            <m:sty m:val="p"/>
-          </m:rPr>
-          <m:t>∂</m:t>
-        </m:r>
-        <m:acc>
-          <m:accPr>
-            <m:chr m:val="‾"/>
-          </m:accPr>
+          <m:t>Δ</m:t>
+        </m:r>
+        <m:sSub>
           <m:e>
             <m:r>
               <m:t>T</m:t>
             </m:r>
           </m:e>
-        </m:acc>
-        <m:r>
-          <m:rPr>
-            <m:sty m:val="p"/>
-          </m:rPr>
-          <m:t>/</m:t>
-        </m:r>
-        <m:r>
-          <m:rPr>
-            <m:sty m:val="p"/>
-          </m:rPr>
-          <m:t>∂</m:t>
-        </m:r>
-        <m:r>
-          <m:t>y</m:t>
-        </m:r>
+          <m:sub>
+            <m:r>
+              <m:t>2.5</m:t>
+            </m:r>
+          </m:sub>
+        </m:sSub>
       </m:oMath>
       <w:r>
         <w:t xml:space="preserve"> </w:t>
       </w:r>
       <w:r>
-        <w:t xml:space="preserve">and in storm track activity (not shown).</w:t>
+        <w:t xml:space="preserve">by season in DJF and JJA (Figure S1 a) show similar spatial patterns and the same sign of the change when compared with the change per year in</w:t>
+      </w:r>
+      <w:r>
+        <w:t xml:space="preserve"> </w:t>
+      </w:r>
+      <w:hyperlink w:anchor="fig-trend">
+        <w:r>
+          <w:rPr>
+            <w:rStyle w:val="Hyperlink"/>
+          </w:rPr>
+          <w:t xml:space="preserve">Figure 1</w:t>
+        </w:r>
+      </w:hyperlink>
+      <w:r>
+        <w:t xml:space="preserve"> </w:t>
+      </w:r>
+      <w:r>
+        <w:t xml:space="preserve">a). The main exception is western Europe, where we see an increase in front frequency during winter but a decrease in summer.</w:t>
       </w:r>
     </w:p>
     <w:tbl>
@@ -2208,7 +2400,7 @@
             <w:r>
               <w:drawing>
                 <wp:inline>
-                  <wp:extent cx="5334000" cy="2667000"/>
+                  <wp:extent cx="5334000" cy="4667250"/>
                   <wp:effectExtent b="0" l="0" r="0" t="0"/>
                   <wp:docPr descr="" title="" id="27" name="Picture"/>
                   <a:graphic>
@@ -2229,7 +2421,7 @@
                         <pic:spPr bwMode="auto">
                           <a:xfrm>
                             <a:off x="0" y="0"/>
-                            <a:ext cx="5334000" cy="2667000"/>
+                            <a:ext cx="5334000" cy="4667250"/>
                           </a:xfrm>
                           <a:prstGeom prst="rect">
                             <a:avLst/>
@@ -2284,7 +2476,47 @@
               <w:t xml:space="preserve"> </w:t>
             </w:r>
             <w:r>
-              <w:t xml:space="preserve">(days/year, SSP5-8.5 2018-2100 minus Historical 1980-2000) and zonal mean change over sea b) and land c), each grey line represents a model listed in Table 1 and a black line represents the multimodel mean. In a) dotted areas show where at least 90% of the models agree in the sign of change.</w:t>
+              <w:t xml:space="preserve">(days/year, SSP5-8.5 2080-2100 minus Historical 1980-2000) and zonal mean change over b) land and c) sea, each grey line represents a model listed in Table 1 and a black line represents the multimodel mean. In a) dotted areas show where at least 90% of the models agree in the sign of change. d)</w:t>
+            </w:r>
+            <w:r>
+              <w:t xml:space="preserve"> </w:t>
+            </w:r>
+            <m:oMath>
+              <m:r>
+                <m:t>Δ</m:t>
+              </m:r>
+              <m:r>
+                <m:t>T</m:t>
+              </m:r>
+            </m:oMath>
+            <w:r>
+              <w:t xml:space="preserve"> </w:t>
+            </w:r>
+            <w:r>
+              <w:t xml:space="preserve">values associated to the 2.5</w:t>
+            </w:r>
+            <m:oMath>
+              <m:sSup>
+                <m:e>
+                  <m:r>
+                    <m:t>​</m:t>
+                  </m:r>
+                </m:e>
+                <m:sup>
+                  <m:r>
+                    <m:t>t</m:t>
+                  </m:r>
+                  <m:r>
+                    <m:t>h</m:t>
+                  </m:r>
+                </m:sup>
+              </m:sSup>
+            </m:oMath>
+            <w:r>
+              <w:t xml:space="preserve"> </w:t>
+            </w:r>
+            <w:r>
+              <w:t xml:space="preserve">percentile and zonal mean over e) land and f) sea.</w:t>
             </w:r>
           </w:p>
           <w:bookmarkEnd w:id="29"/>
@@ -2321,7 +2553,7 @@
         </w:r>
       </w:hyperlink>
       <w:r>
-        <w:t xml:space="preserve">, the trends in frequency are negative over ocean in the Northern hemisphere, but positive over land equatorward of 50</w:t>
+        <w:t xml:space="preserve">, the trends in frequency are negative over ocean in the Northern Hemisphere, but positive over land equatorward of 50</w:t>
       </w:r>
       <m:oMath>
         <m:sSup>
@@ -2344,7 +2576,7 @@
         <w:t xml:space="preserve"> </w:t>
       </w:r>
       <w:r>
-        <w:t xml:space="preserve">N. Over the Southern hemisphere, trends are generally positive over land, with changes over ocean generally consistent with a poleward shift of fronts.</w:t>
+        <w:t xml:space="preserve">N. Over the Southern Hemisphere, trends are generally positive over land, with changes over ocean generally consistent with a poleward shift of fronts.</w:t>
       </w:r>
     </w:p>
     <w:p>
@@ -2441,7 +2673,7 @@
               <w:pStyle w:val="ImageCaption"/>
             </w:pPr>
             <w:r>
-              <w:t xml:space="preserve">Figure 2: Multimodel mean frequency of</w:t>
+              <w:t xml:space="preserve">Figure 2: Multimodel yearly mean frequency of</w:t>
             </w:r>
             <w:r>
               <w:t xml:space="preserve"> </w:t>
@@ -2490,7 +2722,7 @@
               </m:sSub>
             </m:oMath>
             <w:r>
-              <w:t xml:space="preserve">/year. On the right of each panel box plots of the intermodel distribution is shown for the period 2080-2100. In the boxplots the lower and upper hinges correspond to the first and third quartiles and the upper (lower) whisker extends to the largest (smallest) value no further than 1.5 * inter-quartile range. Outside the whiskers dots represents outliners.</w:t>
+              <w:t xml:space="preserve">/year. On the right of each panel box plots of the intermodel distribution is shown for the period 2080-2100. In the boxplots the lower and upper hinges correspond to the first and third quartiles and the upper (lower) whisker extends to the largest (smallest) value no further than 1.5 * inter-quartile range. Outside the whiskers dots represents outliers.</w:t>
             </w:r>
           </w:p>
           <w:bookmarkEnd w:id="33"/>
@@ -2519,7 +2751,7 @@
         <w:t xml:space="preserve"> </w:t>
       </w:r>
       <w:r>
-        <w:t xml:space="preserve">shows the change in frequency of</w:t>
+        <w:t xml:space="preserve">shows the change in the frequency of</w:t>
       </w:r>
       <w:r>
         <w:t xml:space="preserve"> </w:t>
@@ -2595,11 +2827,13 @@
       <w:r>
         <w:t xml:space="preserve">.</w:t>
       </w:r>
-      <w:r>
-        <w:t xml:space="preserve"> </w:t>
-      </w:r>
-      <w:r>
-        <w:t xml:space="preserve">This figure shows that the change in the frequency of</w:t>
+    </w:p>
+    <w:p>
+      <w:pPr>
+        <w:pStyle w:val="BodyText"/>
+      </w:pPr>
+      <w:r>
+        <w:t xml:space="preserve">This figure shows that, in most cases, the sign of the change is the same across all percentile thresholds, meaning that there is a projected increase or decrease in the frequency of</w:t>
       </w:r>
       <w:r>
         <w:t xml:space="preserve"> </w:t>
@@ -2616,7 +2850,81 @@
         <w:t xml:space="preserve"> </w:t>
       </w:r>
       <w:r>
-        <w:t xml:space="preserve">is greater at lower percentile thresholds, which identify more extreme temperature falls. For example in the Northern Hemisphere over the sea, the 0.1 percentile threshold shows that there will be less than half as many falls in temperature in the future over 50</w:t>
+        <w:t xml:space="preserve">regardless of the intensity of the temperature drop. The exceptions are the Southern Hemisphere over sea and the Northern Hemisphere over Land in the 40</w:t>
+      </w:r>
+      <w:r>
+        <w:t xml:space="preserve"> </w:t>
+      </w:r>
+      <m:oMath>
+        <m:sSup>
+          <m:e>
+            <m:r>
+              <m:t>​</m:t>
+            </m:r>
+          </m:e>
+          <m:sup>
+            <m:r>
+              <m:rPr>
+                <m:sty m:val="p"/>
+              </m:rPr>
+              <m:t>∘</m:t>
+            </m:r>
+          </m:sup>
+        </m:sSup>
+      </m:oMath>
+      <w:r>
+        <w:t xml:space="preserve"> </w:t>
+      </w:r>
+      <w:r>
+        <w:t xml:space="preserve">latitude band, were its expected to see a modest increase in strong temperature drops but a small decrease in weaker ones.</w:t>
+      </w:r>
+    </w:p>
+    <w:p>
+      <w:pPr>
+        <w:pStyle w:val="BodyText"/>
+      </w:pPr>
+      <w:r>
+        <w:t xml:space="preserve">It is also interesting to note that the change in the frequency of</w:t>
+      </w:r>
+      <w:r>
+        <w:t xml:space="preserve"> </w:t>
+      </w:r>
+      <m:oMath>
+        <m:r>
+          <m:t>Δ</m:t>
+        </m:r>
+        <m:r>
+          <m:t>T</m:t>
+        </m:r>
+      </m:oMath>
+      <w:r>
+        <w:t xml:space="preserve"> </w:t>
+      </w:r>
+      <w:r>
+        <w:t xml:space="preserve">is greater at lower percentile thresholds, which identify more extreme temperature drops. For example in the Northern Hemisphere over the sea, the 0.1</w:t>
+      </w:r>
+      <m:oMath>
+        <m:sSup>
+          <m:e>
+            <m:r>
+              <m:t>​</m:t>
+            </m:r>
+          </m:e>
+          <m:sup>
+            <m:r>
+              <m:t>t</m:t>
+            </m:r>
+            <m:r>
+              <m:t>h</m:t>
+            </m:r>
+          </m:sup>
+        </m:sSup>
+      </m:oMath>
+      <w:r>
+        <w:t xml:space="preserve"> </w:t>
+      </w:r>
+      <w:r>
+        <w:t xml:space="preserve">percentile threshold shows that there will be less than half as many falls in temperature in the future over 50</w:t>
       </w:r>
       <m:oMath>
         <m:sSup>
@@ -2751,20 +3059,20 @@
               <w:t xml:space="preserve"> </w:t>
             </w:r>
             <w:r>
-              <w:t xml:space="preserve">averaged between the years 2081-2100 under the SSP5-8.5 scenario compared to that averaged between 1980-2000 in the historical scenario, for different thresholds defined by their percentile value for each grid point and model calculated over the historical period (1979-2014).</w:t>
+              <w:t xml:space="preserve">averaged between the years 2080-2100 under the SSP5-8.5 scenario compared to that averaged between 1980-2000 in the historical scenario, for different thresholds defined by their percentile value for each grid point and model calculated over the historical period (1979-2014).</w:t>
             </w:r>
           </w:p>
           <w:bookmarkEnd w:id="37"/>
         </w:tc>
       </w:tr>
     </w:tbl>
-    <w:bookmarkStart w:id="42" w:name="mecanisms"/>
+    <w:bookmarkStart w:id="42" w:name="mechanisms"/>
     <w:p>
       <w:pPr>
         <w:pStyle w:val="Heading3"/>
       </w:pPr>
       <w:r>
-        <w:t xml:space="preserve">Mecanisms</w:t>
+        <w:t xml:space="preserve">Mechanisms</w:t>
       </w:r>
     </w:p>
     <w:p>
@@ -3063,11 +3371,16 @@
         </m:r>
       </m:oMath>
       <w:r>
-        <w:t xml:space="preserve">.</w:t>
-      </w:r>
-      <w:r>
-        <w:t xml:space="preserve"> </w:t>
-      </w:r>
+        <w:t xml:space="preserve"> </w:t>
+      </w:r>
+      <w:r>
+        <w:t xml:space="preserve">and this relationship is particularly strong in the Northern Hemisphere.</w:t>
+      </w:r>
+    </w:p>
+    <w:p>
+      <w:pPr>
+        <w:pStyle w:val="BodyText"/>
+      </w:pPr>
       <w:r>
         <w:t xml:space="preserve">A similar relationship across the ensemble is present when comparing changes in the frequency of</w:t>
       </w:r>
@@ -3095,7 +3408,7 @@
         <w:t xml:space="preserve"> </w:t>
       </w:r>
       <w:r>
-        <w:t xml:space="preserve">and changes in the energy of the storm track. Here we estimate the storm track energy by taking the band-pass filtered eddy kinetic energy at 250 hPa (see</w:t>
+        <w:t xml:space="preserve">and changes in the energy of the storm track. Here we estimate the storm track energy by taking the high-pass filtered eddy kinetic energy at 250 hPa (see</w:t>
       </w:r>
       <w:r>
         <w:t xml:space="preserve"> </w:t>
@@ -3216,7 +3529,7 @@
         <w:t xml:space="preserve">(Muir and Reeder 2010)</w:t>
       </w:r>
       <w:r>
-        <w:t xml:space="preserve">. Another hypothesis is that the most of the land affected by fronts in the Southern hemisphere is north of the mean storm tracks, and thus the storm tracks has only a weak effect on temperature variability there.</w:t>
+        <w:t xml:space="preserve">. Another hypothesis is that the most of the land affected by fronts in the Southern Hemisphere is north of the mean storm tracks, and thus the storm tracks has only a weak effect on temperature variability there.</w:t>
       </w:r>
       <w:r>
         <w:t xml:space="preserve"> </w:t>
@@ -3307,7 +3620,38 @@
         <w:pStyle w:val="BodyText"/>
       </w:pPr>
       <w:r>
-        <w:t xml:space="preserve">Notwithstanding the above caveat, our results suggest that changes in the mean meridional temperature gradient and storm track intensity play an important role in modulating changes in front frequency in a warming climate. Indeed, differences in how these quantities change in projections appear to account for the differences in front frequency changes between hemispheres. However, our results do not provide strong evidence for the relative importance of the two factors: aside from over Southern Hemisphere land, both factors correlate with the</w:t>
+        <w:t xml:space="preserve">The results associated with changes in EKE by season align with previous literature</w:t>
+      </w:r>
+      <w:r>
+        <w:t xml:space="preserve"> </w:t>
+      </w:r>
+      <w:r>
+        <w:t xml:space="preserve">(Priestley and Catto 2022; O’Gorman 2010)</w:t>
+      </w:r>
+      <w:r>
+        <w:t xml:space="preserve">, with a general increase in EKE during summer and a decrease in winter in the Northern Hemisphere and a general positive change in the Southern Hemisphere in both seasons associated with a poleward shift of the storm tracks (Figure S2 c-d). Given these seasonal asymmetries, it is important to note that the change in EKE averaged over the entire year (</w:t>
+      </w:r>
+      <w:hyperlink w:anchor="fig-eke">
+        <w:r>
+          <w:rPr>
+            <w:rStyle w:val="Hyperlink"/>
+          </w:rPr>
+          <w:t xml:space="preserve">Figure 4</w:t>
+        </w:r>
+      </w:hyperlink>
+      <w:r>
+        <w:t xml:space="preserve"> </w:t>
+      </w:r>
+      <w:r>
+        <w:t xml:space="preserve">b) is strongly associated with the winter season in each hemisphere.</w:t>
+      </w:r>
+    </w:p>
+    <w:p>
+      <w:pPr>
+        <w:pStyle w:val="BodyText"/>
+      </w:pPr>
+      <w:r>
+        <w:t xml:space="preserve">Notwithstanding the above caveats, our results suggest that changes in the mean meridional temperature gradient and storm track intensity play an important role in modulating changes in front frequency in a warming climate. Indeed, differences in how these quantities change in projections appear to account for the differences in front frequency changes between hemispheres. However, our results do not provide strong evidence for the relative importance of the two factors: aside from over Southern Hemisphere, both factors correlate with the</w:t>
       </w:r>
       <w:r>
         <w:t xml:space="preserve"> </w:t>
@@ -3476,7 +3820,7 @@
               <w:t xml:space="preserve"> </w:t>
             </w:r>
             <w:r>
-              <w:t xml:space="preserve">and b) the eddy kinetic energy of the storm track EKE for SSP5-8.5 (2080-2100) compared with the historical period (1980-2000) for each model. Values are calculated for the northern (25</w:t>
+              <w:t xml:space="preserve">and b) the eddy kinetic energy of the storm track EKE for SSP5-8.5 (2080-2100) compared with the historical period (1980-2000) for each model. Values are calculated for the Northern (25</w:t>
             </w:r>
             <m:oMath>
               <m:sSup>
@@ -3519,7 +3863,7 @@
               </m:sSup>
             </m:oMath>
             <w:r>
-              <w:t xml:space="preserve">) and southern (-25</w:t>
+              <w:t xml:space="preserve">) and Southern (-25</w:t>
             </w:r>
             <m:oMath>
               <m:sSup>
@@ -3562,7 +3906,7 @@
               </m:sSup>
             </m:oMath>
             <w:r>
-              <w:t xml:space="preserve">) hemispheres and over sea (circles) and land (triangles). Each solid line corresponds to a linear regression for each hemisphere.</w:t>
+              <w:t xml:space="preserve">) Hemispheres and over sea (circles) and land (triangles). Each solid line corresponds to a linear regression for each hemisphere.</w:t>
             </w:r>
           </w:p>
           <w:bookmarkEnd w:id="41"/>
@@ -3654,7 +3998,7 @@
         <w:t xml:space="preserve"> </w:t>
       </w:r>
       <w:r>
-        <w:t xml:space="preserve">This may reflect the fact that storm track dynamics have less direct control over frontal systems, which could be more influenced by mesoscale processes, land–sea contrast, and regional thermodynamic effects.</w:t>
+        <w:t xml:space="preserve">This may reflect the fact that storm track dynamics have less direct control over frontal systems in this region, which could be more influenced by mesoscale processes, land–sea contrast, and regional thermodynamic effects.</w:t>
       </w:r>
     </w:p>
     <w:p>
@@ -3695,6 +4039,23 @@
       </w:pPr>
       <w:r>
         <w:t xml:space="preserve">More generally, frontal cyclogenesis is directly affected by the wind and temperature fields. Consequently, projected changes in frontal frequency may also reflect modifications in the large-scale circulation, such as shifts in the background flow, changes in horizontal wind shear, or variations in baroclinicity. Further analysis is needed to quantify the contribution of these mechanisms to projected changes.</w:t>
+      </w:r>
+    </w:p>
+    <w:p>
+      <w:pPr>
+        <w:pStyle w:val="BodyText"/>
+      </w:pPr>
+      <w:r>
+        <w:t xml:space="preserve">Finally, this study focuses on cold fronts although warm fronts also play an important role in the distribution of extreme precipitation</w:t>
+      </w:r>
+      <w:r>
+        <w:t xml:space="preserve"> </w:t>
+      </w:r>
+      <w:r>
+        <w:t xml:space="preserve">(Catto and Pfahl 2013)</w:t>
+      </w:r>
+      <w:r>
+        <w:t xml:space="preserve">. We explored extending the methodology to warm fronts by considering day-to-day increases in maximum temperature. However, unlike cold fronts, warm fronts are not associated with a sufficiently distinct temperature signal to allow a simple threshold-based identification without also including changes associated with other local thermodynamic processes. Developing a simple and robust method for identifying warm fronts would extend the present framework and provide further insight into projected changes in frontal activity under climate change.</w:t>
       </w:r>
     </w:p>
     <w:bookmarkEnd w:id="44"/>
@@ -3863,7 +4224,7 @@
       </w:r>
     </w:p>
     <w:bookmarkEnd w:id="49"/>
-    <w:bookmarkStart w:id="145" w:name="references"/>
+    <w:bookmarkStart w:id="147" w:name="references"/>
     <w:p>
       <w:pPr>
         <w:pStyle w:val="Heading2"/>
@@ -3872,7 +4233,7 @@
         <w:t xml:space="preserve">References</w:t>
       </w:r>
     </w:p>
-    <w:bookmarkStart w:id="144" w:name="refs"/>
+    <w:bookmarkStart w:id="146" w:name="refs"/>
     <w:bookmarkStart w:id="51" w:name="ref-quarto"/>
     <w:p>
       <w:pPr>
@@ -5742,12 +6103,58 @@
       </w:r>
     </w:p>
     <w:bookmarkEnd w:id="115"/>
-    <w:bookmarkStart w:id="117" w:name="ref-R"/>
+    <w:bookmarkStart w:id="117" w:name="ref-Priestley2022"/>
     <w:p>
       <w:pPr>
         <w:pStyle w:val="Bibliography"/>
       </w:pPr>
       <w:r>
+        <w:t xml:space="preserve">Priestley, Matthew D. K., and Jennifer L. Catto. 2022.</w:t>
+      </w:r>
+      <w:r>
+        <w:t xml:space="preserve"> </w:t>
+      </w:r>
+      <w:r>
+        <w:t xml:space="preserve">“Future Changes in the Extratropical Storm Tracks and Cyclone Intensity, Wind Speed, and Structure.”</w:t>
+      </w:r>
+      <w:r>
+        <w:t xml:space="preserve"> </w:t>
+      </w:r>
+      <w:r>
+        <w:rPr>
+          <w:i/>
+          <w:iCs/>
+        </w:rPr>
+        <w:t xml:space="preserve">Weather and Climate Dynamics</w:t>
+      </w:r>
+      <w:r>
+        <w:t xml:space="preserve"> </w:t>
+      </w:r>
+      <w:r>
+        <w:t xml:space="preserve">3 (1): 337–60.</w:t>
+      </w:r>
+      <w:r>
+        <w:t xml:space="preserve"> </w:t>
+      </w:r>
+      <w:hyperlink r:id="rId116">
+        <w:r>
+          <w:rPr>
+            <w:rStyle w:val="Hyperlink"/>
+          </w:rPr>
+          <w:t xml:space="preserve">https://doi.org/10.5194/wcd-3-337-2022</w:t>
+        </w:r>
+      </w:hyperlink>
+      <w:r>
+        <w:t xml:space="preserve">.</w:t>
+      </w:r>
+    </w:p>
+    <w:bookmarkEnd w:id="117"/>
+    <w:bookmarkStart w:id="119" w:name="ref-R"/>
+    <w:p>
+      <w:pPr>
+        <w:pStyle w:val="Bibliography"/>
+      </w:pPr>
+      <w:r>
         <w:t xml:space="preserve">R Core Team. 2023.</w:t>
       </w:r>
       <w:r>
@@ -5765,7 +6172,7 @@
       <w:r>
         <w:t xml:space="preserve"> </w:t>
       </w:r>
-      <w:hyperlink r:id="rId116">
+      <w:hyperlink r:id="rId118">
         <w:r>
           <w:rPr>
             <w:rStyle w:val="Hyperlink"/>
@@ -5777,8 +6184,8 @@
         <w:t xml:space="preserve">.</w:t>
       </w:r>
     </w:p>
-    <w:bookmarkEnd w:id="117"/>
-    <w:bookmarkStart w:id="119" w:name="ref-Reeder2015"/>
+    <w:bookmarkEnd w:id="119"/>
+    <w:bookmarkStart w:id="121" w:name="ref-Reeder2015"/>
     <w:p>
       <w:pPr>
         <w:pStyle w:val="Bibliography"/>
@@ -5820,7 +6227,7 @@
       <w:r>
         <w:t xml:space="preserve"> </w:t>
       </w:r>
-      <w:hyperlink r:id="rId118">
+      <w:hyperlink r:id="rId120">
         <w:r>
           <w:rPr>
             <w:rStyle w:val="Hyperlink"/>
@@ -5832,8 +6239,8 @@
         <w:t xml:space="preserve">.</w:t>
       </w:r>
     </w:p>
-    <w:bookmarkEnd w:id="119"/>
-    <w:bookmarkStart w:id="121" w:name="ref-Reeder2021"/>
+    <w:bookmarkEnd w:id="121"/>
+    <w:bookmarkStart w:id="123" w:name="ref-Reeder2021"/>
     <w:p>
       <w:pPr>
         <w:pStyle w:val="Bibliography"/>
@@ -5899,7 +6306,7 @@
       <w:r>
         <w:t xml:space="preserve"> </w:t>
       </w:r>
-      <w:hyperlink r:id="rId120">
+      <w:hyperlink r:id="rId122">
         <w:r>
           <w:rPr>
             <w:rStyle w:val="Hyperlink"/>
@@ -5911,8 +6318,8 @@
         <w:t xml:space="preserve">.</w:t>
       </w:r>
     </w:p>
-    <w:bookmarkEnd w:id="121"/>
-    <w:bookmarkStart w:id="123" w:name="ref-Schneider2015"/>
+    <w:bookmarkEnd w:id="123"/>
+    <w:bookmarkStart w:id="125" w:name="ref-Schneider2015"/>
     <w:p>
       <w:pPr>
         <w:pStyle w:val="Bibliography"/>
@@ -5966,7 +6373,7 @@
       <w:r>
         <w:t xml:space="preserve"> </w:t>
       </w:r>
-      <w:hyperlink r:id="rId122">
+      <w:hyperlink r:id="rId124">
         <w:r>
           <w:rPr>
             <w:rStyle w:val="Hyperlink"/>
@@ -5978,8 +6385,8 @@
         <w:t xml:space="preserve">.</w:t>
       </w:r>
     </w:p>
-    <w:bookmarkEnd w:id="123"/>
-    <w:bookmarkStart w:id="125" w:name="ref-Schupfner2019"/>
+    <w:bookmarkEnd w:id="125"/>
+    <w:bookmarkStart w:id="127" w:name="ref-Schupfner2019"/>
     <w:p>
       <w:pPr>
         <w:pStyle w:val="Bibliography"/>
@@ -6035,7 +6442,7 @@
       <w:r>
         <w:t xml:space="preserve"> </w:t>
       </w:r>
-      <w:hyperlink r:id="rId124">
+      <w:hyperlink r:id="rId126">
         <w:r>
           <w:rPr>
             <w:rStyle w:val="Hyperlink"/>
@@ -6047,8 +6454,8 @@
         <w:t xml:space="preserve">.</w:t>
       </w:r>
     </w:p>
-    <w:bookmarkEnd w:id="125"/>
-    <w:bookmarkStart w:id="127" w:name="ref-Simmonds2012"/>
+    <w:bookmarkEnd w:id="127"/>
+    <w:bookmarkStart w:id="129" w:name="ref-Simmonds2012"/>
     <w:p>
       <w:pPr>
         <w:pStyle w:val="Bibliography"/>
@@ -6114,7 +6521,7 @@
       <w:r>
         <w:t xml:space="preserve"> </w:t>
       </w:r>
-      <w:hyperlink r:id="rId126">
+      <w:hyperlink r:id="rId128">
         <w:r>
           <w:rPr>
             <w:rStyle w:val="Hyperlink"/>
@@ -6126,8 +6533,8 @@
         <w:t xml:space="preserve">.</w:t>
       </w:r>
     </w:p>
-    <w:bookmarkEnd w:id="127"/>
-    <w:bookmarkStart w:id="129" w:name="ref-Tamarin2017"/>
+    <w:bookmarkEnd w:id="129"/>
+    <w:bookmarkStart w:id="131" w:name="ref-Tamarin2017"/>
     <w:p>
       <w:pPr>
         <w:pStyle w:val="Bibliography"/>
@@ -6172,7 +6579,7 @@
       <w:r>
         <w:t xml:space="preserve"> </w:t>
       </w:r>
-      <w:hyperlink r:id="rId128">
+      <w:hyperlink r:id="rId130">
         <w:r>
           <w:rPr>
             <w:rStyle w:val="Hyperlink"/>
@@ -6184,8 +6591,8 @@
         <w:t xml:space="preserve">.</w:t>
       </w:r>
     </w:p>
-    <w:bookmarkEnd w:id="129"/>
-    <w:bookmarkStart w:id="131" w:name="ref-Thomas2019"/>
+    <w:bookmarkEnd w:id="131"/>
+    <w:bookmarkStart w:id="133" w:name="ref-Thomas2019"/>
     <w:p>
       <w:pPr>
         <w:pStyle w:val="Bibliography"/>
@@ -6302,7 +6709,7 @@
       <w:r>
         <w:t xml:space="preserve"> </w:t>
       </w:r>
-      <w:hyperlink r:id="rId130">
+      <w:hyperlink r:id="rId132">
         <w:r>
           <w:rPr>
             <w:rStyle w:val="Hyperlink"/>
@@ -6314,8 +6721,8 @@
         <w:t xml:space="preserve">.</w:t>
       </w:r>
     </w:p>
-    <w:bookmarkEnd w:id="131"/>
-    <w:bookmarkStart w:id="133" w:name="ref-Volodin2019"/>
+    <w:bookmarkEnd w:id="133"/>
+    <w:bookmarkStart w:id="135" w:name="ref-Volodin2019"/>
     <w:p>
       <w:pPr>
         <w:pStyle w:val="Bibliography"/>
@@ -6359,7 +6766,7 @@
       <w:r>
         <w:t xml:space="preserve"> </w:t>
       </w:r>
-      <w:hyperlink r:id="rId132">
+      <w:hyperlink r:id="rId134">
         <w:r>
           <w:rPr>
             <w:rStyle w:val="Hyperlink"/>
@@ -6371,8 +6778,8 @@
         <w:t xml:space="preserve">.</w:t>
       </w:r>
     </w:p>
-    <w:bookmarkEnd w:id="133"/>
-    <w:bookmarkStart w:id="135" w:name="ref-Volodin2019a"/>
+    <w:bookmarkEnd w:id="135"/>
+    <w:bookmarkStart w:id="137" w:name="ref-Volodin2019a"/>
     <w:p>
       <w:pPr>
         <w:pStyle w:val="Bibliography"/>
@@ -6422,7 +6829,7 @@
       <w:r>
         <w:t xml:space="preserve"> </w:t>
       </w:r>
-      <w:hyperlink r:id="rId134">
+      <w:hyperlink r:id="rId136">
         <w:r>
           <w:rPr>
             <w:rStyle w:val="Hyperlink"/>
@@ -6434,8 +6841,8 @@
         <w:t xml:space="preserve">.</w:t>
       </w:r>
     </w:p>
-    <w:bookmarkEnd w:id="135"/>
-    <w:bookmarkStart w:id="137" w:name="ref-Volodin2019c"/>
+    <w:bookmarkEnd w:id="137"/>
+    <w:bookmarkStart w:id="139" w:name="ref-Volodin2019c"/>
     <w:p>
       <w:pPr>
         <w:pStyle w:val="Bibliography"/>
@@ -6485,7 +6892,7 @@
       <w:r>
         <w:t xml:space="preserve"> </w:t>
       </w:r>
-      <w:hyperlink r:id="rId136">
+      <w:hyperlink r:id="rId138">
         <w:r>
           <w:rPr>
             <w:rStyle w:val="Hyperlink"/>
@@ -6497,8 +6904,8 @@
         <w:t xml:space="preserve">.</w:t>
       </w:r>
     </w:p>
-    <w:bookmarkEnd w:id="137"/>
-    <w:bookmarkStart w:id="139" w:name="ref-Volodin2019b"/>
+    <w:bookmarkEnd w:id="139"/>
+    <w:bookmarkStart w:id="141" w:name="ref-Volodin2019b"/>
     <w:p>
       <w:pPr>
         <w:pStyle w:val="Bibliography"/>
@@ -6548,7 +6955,7 @@
       <w:r>
         <w:t xml:space="preserve"> </w:t>
       </w:r>
-      <w:hyperlink r:id="rId138">
+      <w:hyperlink r:id="rId140">
         <w:r>
           <w:rPr>
             <w:rStyle w:val="Hyperlink"/>
@@ -6560,8 +6967,8 @@
         <w:t xml:space="preserve">.</w:t>
       </w:r>
     </w:p>
-    <w:bookmarkEnd w:id="139"/>
-    <w:bookmarkStart w:id="141" w:name="ref-ggplot2"/>
+    <w:bookmarkEnd w:id="141"/>
+    <w:bookmarkStart w:id="143" w:name="ref-ggplot2"/>
     <w:p>
       <w:pPr>
         <w:pStyle w:val="Bibliography"/>
@@ -6584,7 +6991,7 @@
       <w:r>
         <w:t xml:space="preserve"> </w:t>
       </w:r>
-      <w:hyperlink r:id="rId140">
+      <w:hyperlink r:id="rId142">
         <w:r>
           <w:rPr>
             <w:rStyle w:val="Hyperlink"/>
@@ -6596,8 +7003,8 @@
         <w:t xml:space="preserve">.</w:t>
       </w:r>
     </w:p>
-    <w:bookmarkEnd w:id="141"/>
-    <w:bookmarkStart w:id="143" w:name="ref-cowplot"/>
+    <w:bookmarkEnd w:id="143"/>
+    <w:bookmarkStart w:id="145" w:name="ref-cowplot"/>
     <w:p>
       <w:pPr>
         <w:pStyle w:val="Bibliography"/>
@@ -6614,7 +7021,7 @@
       <w:r>
         <w:t xml:space="preserve"> </w:t>
       </w:r>
-      <w:hyperlink r:id="rId142">
+      <w:hyperlink r:id="rId144">
         <w:r>
           <w:rPr>
             <w:rStyle w:val="Hyperlink"/>
@@ -6626,9 +7033,9 @@
         <w:t xml:space="preserve">.</w:t>
       </w:r>
     </w:p>
-    <w:bookmarkEnd w:id="143"/>
-    <w:bookmarkEnd w:id="144"/>
     <w:bookmarkEnd w:id="145"/>
+    <w:bookmarkEnd w:id="146"/>
+    <w:bookmarkEnd w:id="147"/>
     <w:sectPr>
       <w:footnotePr>
         <w:numRestart w:val="eachSect"/>

</xml_diff>

<commit_message>
Small changes and typos
</commit_message>
<xml_diff>
--- a/article/main-article/article.docx
+++ b/article/main-article/article.docx
@@ -2358,7 +2358,7 @@
         <w:t xml:space="preserve"> </w:t>
       </w:r>
       <w:r>
-        <w:t xml:space="preserve">by season in DJF and JJA (Figure S1 a) show similar spatial patterns and the same sign of the change when compared with the change per year in</w:t>
+        <w:t xml:space="preserve">by season in DJF and JJA (Figure S1 a) shows similar spatial patterns and the same sign of the change when compared with the change per year in</w:t>
       </w:r>
       <w:r>
         <w:t xml:space="preserve"> </w:t>
@@ -2493,7 +2493,7 @@
               <w:t xml:space="preserve"> </w:t>
             </w:r>
             <w:r>
-              <w:t xml:space="preserve">values associated to the 2.5</w:t>
+              <w:t xml:space="preserve">values associated with the 2.5</w:t>
             </w:r>
             <m:oMath>
               <m:sSup>

</xml_diff>

<commit_message>
Final update with comments from MR and MS
</commit_message>
<xml_diff>
--- a/article/main-article/article.docx
+++ b/article/main-article/article.docx
@@ -39,7 +39,7 @@
         <w:pStyle w:val="Date"/>
       </w:pPr>
       <w:r>
-        <w:t xml:space="preserve">2026-07-25</w:t>
+        <w:t xml:space="preserve">2026-07-31</w:t>
       </w:r>
     </w:p>
     <w:p>
@@ -55,7 +55,7 @@
         <w:pStyle w:val="Abstract"/>
       </w:pPr>
       <w:r>
-        <w:t xml:space="preserve">We use day-to-day falls in daily-maximum surface air temperature to assess future changes in cold front frequency in a set of CMIP6 climate models under the SSP5-8.5 scenario. We find a general decrease in cold front frequency across the Northern Hemisphere, particularly over the oceans, and a poleward shift in the Southern Hemisphere, with increased frequency over midlatitude land regions. The frequency of strong temperature falls correlates positively with the meridional temperature gradient and transient eddy kinetic energy, implicating large-scale baroclinicity and storm track changes in future frontal behavior. Over Southern Hemisphere land areas, this relationship weakens, suggesting the influence of regional thermodynamic processes.</w:t>
+        <w:t xml:space="preserve">We use day-to-day falls in daily-maximum surface air temperature to assess future changes in the frequency of strong cold fronts in a set of CMIP6 climate models under the SSP5-8.5 scenario. We find a general decrease in cold front frequency across the Northern Hemisphere, particularly over the oceans, and in the Southen Hemisphere a poleward shift in the region of highest frontal frequency, with increased frequency over midlatitude land regions. The frequency of strong temperature falls correlates positively with the meridional temperature gradient and transient eddy kinetic energy, implicating large-scale baroclinicity and changes in the storm track influence the pattern of strong cold fronts. Over Southern Hemisphere land areas, this relationship weakens, suggesting the influence of regional thermodynamic processes.</w:t>
       </w:r>
     </w:p>
     <w:bookmarkStart w:id="20" w:name="introduction"/>
@@ -72,7 +72,7 @@
         <w:pStyle w:val="FirstParagraph"/>
       </w:pPr>
       <w:r>
-        <w:t xml:space="preserve">Cold fronts are an important feature of weather in extratropical regions and their associated circulation contribute a substantial fraction of the preciptiation in these regions</w:t>
+        <w:t xml:space="preserve">Cold fronts are an important feature of weather in extratropical regions and their associated circulation contribute a substantial fraction of the precipitation in these regions</w:t>
       </w:r>
       <w:r>
         <w:t xml:space="preserve"> </w:t>
@@ -81,7 +81,7 @@
         <w:t xml:space="preserve">(Konstali et al. 2024; Catto and Pfahl 2013)</w:t>
       </w:r>
       <w:r>
-        <w:t xml:space="preserve">. Cold fronts are also linked to extreme events, such as heavy precipitation</w:t>
+        <w:t xml:space="preserve">. Cold fronts are at times linked to extreme events, such as heavy precipitation</w:t>
       </w:r>
       <w:r>
         <w:t xml:space="preserve"> </w:t>
@@ -105,7 +105,7 @@
         <w:t xml:space="preserve"> </w:t>
       </w:r>
       <w:r>
-        <w:t xml:space="preserve">and other regions. Understanding how cold fronts change with warming is therefore of importance for understanding the changing likelihood of extremes and fire weather.</w:t>
+        <w:t xml:space="preserve">and other regions. Understanding how cold fronts, and especially strong cold fronts, change in a warming climate is therefore of importance for understanding the changing likelihood of extremes and fire weather.</w:t>
       </w:r>
     </w:p>
     <w:p>
@@ -151,7 +151,7 @@
         <w:pStyle w:val="BodyText"/>
       </w:pPr>
       <w:r>
-        <w:t xml:space="preserve">Here, we take a simpler approach, first introduced by</w:t>
+        <w:t xml:space="preserve">Here, we take the simplest approach, first introduced by</w:t>
       </w:r>
       <w:r>
         <w:t xml:space="preserve"> </w:t>
@@ -184,7 +184,7 @@
         <w:t xml:space="preserve">(King, Reeder, and Jakob 2024)</w:t>
       </w:r>
       <w:r>
-        <w:t xml:space="preserve">. Indeed,</w:t>
+        <w:t xml:space="preserve">.</w:t>
       </w:r>
       <w:r>
         <w:t xml:space="preserve"> </w:t>
@@ -250,7 +250,7 @@
         <w:pStyle w:val="BodyText"/>
       </w:pPr>
       <w:r>
-        <w:t xml:space="preserve">Motivated by the contrasting results of previous studies, here we consider again projections of the CMIP6 ensemble, but we consider a simpler method of estimating changes in front frequency and intensity with cooling based on day-to-day falls in maximum surface air temperature.</w:t>
+        <w:t xml:space="preserve">Motivated by the contrasting results of previous studies, we re-examine how the distribution of cold fronts change in projections from the CMIP6 ensemble, but we consider a simpler method of estimating changes in front frequency and intensity with cooling based on day-to-day falls in maximum surface air temperature.</w:t>
       </w:r>
       <w:r>
         <w:t xml:space="preserve"> </w:t>
@@ -1180,7 +1180,7 @@
         <w:pStyle w:val="FirstParagraph"/>
       </w:pPr>
       <w:r>
-        <w:t xml:space="preserve">We identify falls in near-surface air temperature (2 meter) as a proxy for frontal passages by calculating the change in daily maximum temperature from one day to the next (</w:t>
+        <w:t xml:space="preserve">We identify falls in near-surface (2 meter) air temperature as a proxy for frontal passages by calculating the change in daily maximum temperature from one day to the next (</w:t>
       </w:r>
       <m:oMath>
         <m:r>
@@ -1220,7 +1220,7 @@
         <w:t xml:space="preserve"> </w:t>
       </w:r>
       <w:r>
-        <w:t xml:space="preserve">defined a passage of a strong cold front as a</w:t>
+        <w:t xml:space="preserve">defined a passage of a strong cold front as</w:t>
       </w:r>
       <w:r>
         <w:t xml:space="preserve"> </w:t>
@@ -1312,7 +1312,7 @@
         </m:r>
       </m:oMath>
       <w:r>
-        <w:t xml:space="preserve">. While this value is reasonable for detecting strong falls in temperature over land, it may underestimate the frequency of fronts over the ocean due to the smaller temperature variability. For this reason, in this study, we use the value of the 2.5</w:t>
+        <w:t xml:space="preserve">. While this value is reasonable for detecting strong falls in temperature over land, it may underestimate the frequency of fronts over the ocean due to the weaker temperature variability. For this reason, in this study, we use the 2.5</w:t>
       </w:r>
       <m:oMath>
         <m:sSup>
@@ -1352,7 +1352,7 @@
         <w:t xml:space="preserve"> </w:t>
       </w:r>
       <w:r>
-        <w:t xml:space="preserve">(as we want to capture the most negative temperature falls) as a threshold for each grid point to identify falls in temperature, hereafter</w:t>
+        <w:t xml:space="preserve">as a threshold for each grid point to identify strong falls in temperature, hereafter</w:t>
       </w:r>
       <w:r>
         <w:t xml:space="preserve"> </w:t>
@@ -1566,7 +1566,7 @@
         <w:t xml:space="preserve"> </w:t>
       </w:r>
       <w:r>
-        <w:t xml:space="preserve">generally corresponds to strong fronts, and our identification method produces reasonable results. However, outside these regions (e.g., in the tropics) we identify temperature drops that can be associated to midlatitude frontlike features but also other processes.</w:t>
+        <w:t xml:space="preserve">generally corresponds to strong fronts, and our identification method produces reasonable results. However, outside these regions (e.g., in the tropics) we identify temperature falls that can be associated with midlatitude front-like features but also other processes.</w:t>
       </w:r>
     </w:p>
     <w:bookmarkEnd w:id="22"/>
@@ -2094,7 +2094,7 @@
         <w:t xml:space="preserve"> </w:t>
       </w:r>
       <w:r>
-        <w:t xml:space="preserve">d) show the</w:t>
+        <w:t xml:space="preserve">d) shows the</w:t>
       </w:r>
       <w:r>
         <w:t xml:space="preserve"> </w:t>
@@ -2111,7 +2111,7 @@
         <w:t xml:space="preserve"> </w:t>
       </w:r>
       <w:r>
-        <w:t xml:space="preserve">values associated with the 2.5</w:t>
+        <w:t xml:space="preserve">values that define the 2.5</w:t>
       </w:r>
       <m:oMath>
         <m:sSup>
@@ -2134,7 +2134,7 @@
         <w:t xml:space="preserve"> </w:t>
       </w:r>
       <w:r>
-        <w:t xml:space="preserve">percentile. We found that the spatial pattern correlates with the climatology of cold fronts proposed by</w:t>
+        <w:t xml:space="preserve">percentile. We found that the spatial pattern correlates with the climatology of cold fronts from</w:t>
       </w:r>
       <w:r>
         <w:t xml:space="preserve"> </w:t>
@@ -2146,7 +2146,7 @@
         <w:t xml:space="preserve"> </w:t>
       </w:r>
       <w:r>
-        <w:t xml:space="preserve">(their Figure 2a) or</w:t>
+        <w:t xml:space="preserve">(their Figure 2a) and</w:t>
       </w:r>
       <w:r>
         <w:t xml:space="preserve"> </w:t>
@@ -2158,7 +2158,7 @@
         <w:t xml:space="preserve"> </w:t>
       </w:r>
       <w:r>
-        <w:t xml:space="preserve">(their Figure 6). This shows that temperature drops from one day to the next identified using this percentile are directly related to cold front passages.</w:t>
+        <w:t xml:space="preserve">(their Figure 6). This consistency supports our proposition that temperature falls identified here are directly related to cold front passages.</w:t>
       </w:r>
     </w:p>
     <w:p>
@@ -2324,7 +2324,7 @@
         <w:t xml:space="preserve"> </w:t>
       </w:r>
       <w:r>
-        <w:t xml:space="preserve">This pattern indicates that the areas of higher front frequency shift poleward in the future scenario. In the Indian ocean, the pattern in more complicated, with a second band of increased frequency in the subtropics most pronounced in the Agulas region.</w:t>
+        <w:t xml:space="preserve">This pattern indicates that the areas of higher front frequency shift poleward in the future scenario. In the Indian ocean, the pattern in more complicated, with a second band of increased frequency in the subtropics is most pronounced in the Agulas region.</w:t>
       </w:r>
     </w:p>
     <w:p>
@@ -2375,7 +2375,7 @@
         <w:t xml:space="preserve"> </w:t>
       </w:r>
       <w:r>
-        <w:t xml:space="preserve">a). The main exception is western Europe, where we see an increase in front frequency during winter but a decrease in summer.</w:t>
+        <w:t xml:space="preserve">a). The main exception is western Europe, where we find an increase in front frequency during winter but a decrease in summer.</w:t>
       </w:r>
     </w:p>
     <w:tbl>
@@ -2584,7 +2584,7 @@
         <w:pStyle w:val="BodyText"/>
       </w:pPr>
       <w:r>
-        <w:t xml:space="preserve">While there is considerable variation between models in these trends (see boxplots on right of</w:t>
+        <w:t xml:space="preserve">While there is considerable variation in these trends between models (see boxplots on right of</w:t>
       </w:r>
       <w:r>
         <w:t xml:space="preserve"> </w:t>
@@ -2832,8 +2832,19 @@
       <w:pPr>
         <w:pStyle w:val="BodyText"/>
       </w:pPr>
-      <w:r>
-        <w:t xml:space="preserve">This figure shows that, in most cases, the sign of the change is the same across all percentile thresholds, meaning that there is a projected increase or decrease in the frequency of</w:t>
+      <w:hyperlink w:anchor="fig-distribution">
+        <w:r>
+          <w:rPr>
+            <w:rStyle w:val="Hyperlink"/>
+          </w:rPr>
+          <w:t xml:space="preserve">Figure 3</w:t>
+        </w:r>
+      </w:hyperlink>
+      <w:r>
+        <w:t xml:space="preserve"> </w:t>
+      </w:r>
+      <w:r>
+        <w:t xml:space="preserve">shows that, in most cases, the sign of the change is the same across all percentile thresholds, meaning that there is a projected increase or decrease in the frequency of</w:t>
       </w:r>
       <w:r>
         <w:t xml:space="preserve"> </w:t>
@@ -2850,7 +2861,7 @@
         <w:t xml:space="preserve"> </w:t>
       </w:r>
       <w:r>
-        <w:t xml:space="preserve">regardless of the intensity of the temperature drop. The exceptions are the Southern Hemisphere over sea and the Northern Hemisphere over Land in the 40</w:t>
+        <w:t xml:space="preserve">regardless of the intensity of the temperature fall. The exceptions are the Southern Hemisphere over sea and the Northern Hemisphere over land in the 40</w:t>
       </w:r>
       <w:r>
         <w:t xml:space="preserve"> </w:t>
@@ -2876,7 +2887,7 @@
         <w:t xml:space="preserve"> </w:t>
       </w:r>
       <w:r>
-        <w:t xml:space="preserve">latitude band, were its expected to see a modest increase in strong temperature drops but a small decrease in weaker ones.</w:t>
+        <w:t xml:space="preserve">latitude band, where there is a modest increase in strong temperature falls but a small decrease in weaker falls.</w:t>
       </w:r>
     </w:p>
     <w:p>
@@ -2884,7 +2895,7 @@
         <w:pStyle w:val="BodyText"/>
       </w:pPr>
       <w:r>
-        <w:t xml:space="preserve">It is also interesting to note that the change in the frequency of</w:t>
+        <w:t xml:space="preserve">Moreover the change in the frequency of</w:t>
       </w:r>
       <w:r>
         <w:t xml:space="preserve"> </w:t>
@@ -2901,7 +2912,7 @@
         <w:t xml:space="preserve"> </w:t>
       </w:r>
       <w:r>
-        <w:t xml:space="preserve">is greater at lower percentile thresholds, which identify more extreme temperature drops. For example in the Northern Hemisphere over the sea, the 0.1</w:t>
+        <w:t xml:space="preserve">is greater at lower percentile thresholds, which identify more extreme temperature falls. For example, in the Northern Hemisphere over the sea, the 0.1</w:t>
       </w:r>
       <m:oMath>
         <m:sSup>
@@ -2953,7 +2964,7 @@
         <w:t xml:space="preserve"> </w:t>
       </w:r>
       <w:r>
-        <w:t xml:space="preserve">However, it is important to note that lower percentiles thresholds are associated with rarer events, meaning fewer occurrences per year. These results suggest that regions projected to experience more temperature falls in the future, such as land areas in midlatitudes in the Southern Hemisphere, will also experience more intense</w:t>
+        <w:t xml:space="preserve">However, lower percentile thresholds are associated with rarer events, meaning fewer occurrences per year. These results suggest that regions projected to experience more temperature falls in the future, such as land areas in midlatitudes in the Southern Hemisphere, will also experience larger</w:t>
       </w:r>
       <w:r>
         <w:t xml:space="preserve"> </w:t>
@@ -2967,7 +2978,7 @@
         </m:r>
       </m:oMath>
       <w:r>
-        <w:t xml:space="preserve">, whereas regions with a decreasing frequency of events will see less intense falls in temperature.</w:t>
+        <w:t xml:space="preserve">, whereas regions with a decreasing frequency of falls will see smaller falls.</w:t>
       </w:r>
     </w:p>
     <w:tbl>
@@ -3106,7 +3117,7 @@
         <w:t xml:space="preserve"> </w:t>
       </w:r>
       <w:r>
-        <w:t xml:space="preserve">frequency described above. We consider a simple perspective on midlatitude temperature variability based on advection as a key driver</w:t>
+        <w:t xml:space="preserve">frequency described above. We take a simple perspective on midlatitude temperature variability based on advection as a key driver</w:t>
       </w:r>
       <w:r>
         <w:t xml:space="preserve"> </w:t>
@@ -3151,7 +3162,7 @@
         </m:r>
       </m:oMath>
       <w:r>
-        <w:t xml:space="preserve">) and the eddy kinetic energy (EKE) within the midlatitude storm tracks.</w:t>
+        <w:t xml:space="preserve">) and EKE within the midlatitude storm tracks.</w:t>
       </w:r>
     </w:p>
     <w:p>
@@ -3371,10 +3382,7 @@
         </m:r>
       </m:oMath>
       <w:r>
-        <w:t xml:space="preserve"> </w:t>
-      </w:r>
-      <w:r>
-        <w:t xml:space="preserve">and this relationship is particularly strong in the Northern Hemisphere.</w:t>
+        <w:t xml:space="preserve">, a relationship that is particularly strong in the Northern Hemisphere.</w:t>
       </w:r>
     </w:p>
     <w:p>
@@ -3382,7 +3390,7 @@
         <w:pStyle w:val="BodyText"/>
       </w:pPr>
       <w:r>
-        <w:t xml:space="preserve">A similar relationship across the ensemble is present when comparing changes in the frequency of</w:t>
+        <w:t xml:space="preserve">There is a similar relationship across the ensemble between changes in the frequency of</w:t>
       </w:r>
       <w:r>
         <w:t xml:space="preserve"> </w:t>
@@ -3529,7 +3537,7 @@
         <w:t xml:space="preserve">(Muir and Reeder 2010)</w:t>
       </w:r>
       <w:r>
-        <w:t xml:space="preserve">. Another hypothesis is that the most of the land affected by fronts in the Southern Hemisphere is north of the mean storm tracks, and thus the storm tracks has only a weak effect on temperature variability there.</w:t>
+        <w:t xml:space="preserve">. Moreover, most of the land affected by fronts in the Southern Hemisphere is north of the mean storm track, and thus the storm track has only a weak effect on temperature variability there.</w:t>
       </w:r>
       <w:r>
         <w:t xml:space="preserve"> </w:t>
@@ -3620,7 +3628,7 @@
         <w:pStyle w:val="BodyText"/>
       </w:pPr>
       <w:r>
-        <w:t xml:space="preserve">The results associated with changes in EKE by season align with previous literature</w:t>
+        <w:t xml:space="preserve">In agreement with the previous literature on seasonal changes n the midlatitude storm track</w:t>
       </w:r>
       <w:r>
         <w:t xml:space="preserve"> </w:t>
@@ -3629,7 +3637,7 @@
         <w:t xml:space="preserve">(Priestley and Catto 2022; O’Gorman 2010)</w:t>
       </w:r>
       <w:r>
-        <w:t xml:space="preserve">, with a general increase in EKE during summer and a decrease in winter in the Northern Hemisphere and a general positive change in the Southern Hemisphere in both seasons associated with a poleward shift of the storm tracks (Figure S2 c-d). Given these seasonal asymmetries, it is important to note that the change in EKE averaged over the entire year (</w:t>
+        <w:t xml:space="preserve">, we find a general increase in EKE during summer and a decrease in winter in the Northern Hemisphere. There is also a general positive change in the Southern Hemisphere in both seasons associated with a poleward shift of the storm tracks (Figure S2 c-d). Given these seasonal asymmetries, it is important to note that the change in EKE averaged over the entire year (</w:t>
       </w:r>
       <w:hyperlink w:anchor="fig-eke">
         <w:r>
@@ -3643,7 +3651,7 @@
         <w:t xml:space="preserve"> </w:t>
       </w:r>
       <w:r>
-        <w:t xml:space="preserve">b) is strongly associated with the winter season in each hemisphere.</w:t>
+        <w:t xml:space="preserve">b) is dominated by the winter season in each hemisphere.</w:t>
       </w:r>
     </w:p>
     <w:p>
@@ -3820,7 +3828,7 @@
               <w:t xml:space="preserve"> </w:t>
             </w:r>
             <w:r>
-              <w:t xml:space="preserve">and b) the eddy kinetic energy of the storm track EKE for SSP5-8.5 (2080-2100) compared with the historical period (1980-2000) for each model. Values are calculated for the Northern (25</w:t>
+              <w:t xml:space="preserve">and b) the EKE of the storm track for SSP5-8.5 (2080-2100) compared with the historical period (1980-2000) for each model. Values are calculated for the Northern (25</w:t>
             </w:r>
             <m:oMath>
               <m:sSup>
@@ -3929,7 +3937,16 @@
         <w:pStyle w:val="FirstParagraph"/>
       </w:pPr>
       <w:r>
-        <w:t xml:space="preserve">In this study, we use day-to-day falls in near-surface maximum temperature as a method to detect cold fronts and to evaluate changes in their frequency under future warming, in a set of 10 models from CMIP6. By using a specific percentile threshold, we ensure a consistent detection of strong temperature falls across different regions, improving the detection particularly over oceans where the temperature variability is lower. While the temperature drop method may misidentify other forms of temperature variability as fronts, previous studies have shown that this methodology provides a simple and robust method for characterising the frequency of fronts over midlatitude regions.</w:t>
+        <w:t xml:space="preserve">In this study, we use day-to-day falls in near-surface maximum temperature to detect cold fronts, and we evaluate changes in their frequency under future warming in a set of 10 models from CMIP6. By using a specific percentile threshold, we ensure a consistent detection of strong temperature falls across different regions, improving the detection particularly over oceans where the temperature variability is lower. While the temperature fall method may occasionally misidentify other forms of temperature variability as fronts, previous studies have shown that this methodology provides a simple and robust method for characterising the frequency of fronts over midlatitude regions</w:t>
+      </w:r>
+      <w:r>
+        <w:t xml:space="preserve"> </w:t>
+      </w:r>
+      <w:r>
+        <w:t xml:space="preserve">(King, Reeder, and Jakob 2024)</w:t>
+      </w:r>
+      <w:r>
+        <w:t xml:space="preserve">.</w:t>
       </w:r>
     </w:p>
     <w:p>
@@ -4018,7 +4035,7 @@
         <w:t xml:space="preserve"> </w:t>
       </w:r>
       <w:r>
-        <w:t xml:space="preserve">showed that surface sensible heat fluxes associated with strong SST gradients, such as those found in the Gulf Stream or Kuroshio Current regions, can amplify fronts through diabatic frontogenesis. However,</w:t>
+        <w:t xml:space="preserve">suggested that surface sensible heat fluxes associated with strong SST gradients, such as those found in the Gulf Stream or Kuroshio Current regions, can amplify atmospheric fronts through diabatic frontogenesis, although</w:t>
       </w:r>
       <w:r>
         <w:t xml:space="preserve"> </w:t>
@@ -4030,7 +4047,19 @@
         <w:t xml:space="preserve"> </w:t>
       </w:r>
       <w:r>
-        <w:t xml:space="preserve">showed that atmospheric fronts along SST fronts are amplified primarily by adiabatic frontogenesis, i.e. the deformation of the wind field that helps increase the equivalent potential temperature gradient.</w:t>
+        <w:t xml:space="preserve">showed that the effect was only significant when the fronts were weak. In contrast,</w:t>
+      </w:r>
+      <w:r>
+        <w:t xml:space="preserve"> </w:t>
+      </w:r>
+      <w:r>
+        <w:t xml:space="preserve">Reeder, Spengler, and Spensberger (2021)</w:t>
+      </w:r>
+      <w:r>
+        <w:t xml:space="preserve"> </w:t>
+      </w:r>
+      <w:r>
+        <w:t xml:space="preserve">showed that strong atmospheric fronts along SST fronts are amplified primarily by adiabatic frontogenesis (i.e. the deformation of the wind field).</w:t>
       </w:r>
     </w:p>
     <w:p>
@@ -4046,7 +4075,7 @@
         <w:pStyle w:val="BodyText"/>
       </w:pPr>
       <w:r>
-        <w:t xml:space="preserve">Finally, this study focuses on cold fronts although warm fronts also play an important role in the distribution of extreme precipitation</w:t>
+        <w:t xml:space="preserve">Finally, while this study focuses on cold fronts, in some regions warm fronts also play an important role in the distribution of extreme precipitation</w:t>
       </w:r>
       <w:r>
         <w:t xml:space="preserve"> </w:t>
@@ -4202,7 +4231,7 @@
           <w:rPr>
             <w:rStyle w:val="Hyperlink"/>
           </w:rPr>
-          <w:t xml:space="preserve">https://doi.org/10.5281/zenodo.20019441</w:t>
+          <w:t xml:space="preserve">https://doi.org/10.5281/zenodo.21713532</w:t>
         </w:r>
       </w:hyperlink>
       <w:r>

</xml_diff>

<commit_message>
Update DOI for repo
</commit_message>
<xml_diff>
--- a/article/main-article/article.docx
+++ b/article/main-article/article.docx
@@ -4231,7 +4231,7 @@
           <w:rPr>
             <w:rStyle w:val="Hyperlink"/>
           </w:rPr>
-          <w:t xml:space="preserve">https://doi.org/10.5281/zenodo.21713532</w:t>
+          <w:t xml:space="preserve">https://doi.org/10.5281/zenodo.21713780</w:t>
         </w:r>
       </w:hyperlink>
       <w:r>
@@ -4245,11 +4245,11 @@
           <w:rPr>
             <w:rStyle w:val="Hyperlink"/>
           </w:rPr>
-          <w:t xml:space="preserve">https://doi.org/10.5281/zenodo.19840311</w:t>
+          <w:t xml:space="preserve">https://doi.org/10.5281/zenodo.21713532</w:t>
         </w:r>
       </w:hyperlink>
       <w:r>
-        <w:t xml:space="preserve">, version 0.9.</w:t>
+        <w:t xml:space="preserve">.</w:t>
       </w:r>
     </w:p>
     <w:bookmarkEnd w:id="49"/>

</xml_diff>

<commit_message>
update path to figures
</commit_message>
<xml_diff>
--- a/article/main-article/article.docx
+++ b/article/main-article/article.docx
@@ -39,7 +39,7 @@
         <w:pStyle w:val="Date"/>
       </w:pPr>
       <w:r>
-        <w:t xml:space="preserve">2026-07-31</w:t>
+        <w:t xml:space="preserve">2026-08-06</w:t>
       </w:r>
     </w:p>
     <w:p>
@@ -2407,7 +2407,7 @@
                     <a:graphicData uri="http://schemas.openxmlformats.org/drawingml/2006/picture">
                       <pic:pic>
                         <pic:nvPicPr>
-                          <pic:cNvPr descr="article_files/figure-docx/fig-trend-1.png" id="28" name="Picture"/>
+                          <pic:cNvPr descr="fig-trend-1.png" id="28" name="Picture"/>
                           <pic:cNvPicPr>
                             <a:picLocks noChangeArrowheads="1" noChangeAspect="1"/>
                           </pic:cNvPicPr>
@@ -2630,7 +2630,7 @@
                     <a:graphicData uri="http://schemas.openxmlformats.org/drawingml/2006/picture">
                       <pic:pic>
                         <pic:nvPicPr>
-                          <pic:cNvPr descr="article_files/figure-docx/fig-serie-1.png" id="32" name="Picture"/>
+                          <pic:cNvPr descr="fig-serie-1.png" id="32" name="Picture"/>
                           <pic:cNvPicPr>
                             <a:picLocks noChangeArrowheads="1" noChangeAspect="1"/>
                           </pic:cNvPicPr>
@@ -3010,7 +3010,7 @@
                     <a:graphicData uri="http://schemas.openxmlformats.org/drawingml/2006/picture">
                       <pic:pic>
                         <pic:nvPicPr>
-                          <pic:cNvPr descr="article_files/figure-docx/fig-distribution-1.png" id="36" name="Picture"/>
+                          <pic:cNvPr descr="fig-distribution-1.png" id="36" name="Picture"/>
                           <pic:cNvPicPr>
                             <a:picLocks noChangeArrowheads="1" noChangeAspect="1"/>
                           </pic:cNvPicPr>
@@ -3717,7 +3717,7 @@
                     <a:graphicData uri="http://schemas.openxmlformats.org/drawingml/2006/picture">
                       <pic:pic>
                         <pic:nvPicPr>
-                          <pic:cNvPr descr="article_files/figure-docx/fig-eke-1.png" id="40" name="Picture"/>
+                          <pic:cNvPr descr="fig-eke-1.png" id="40" name="Picture"/>
                           <pic:cNvPicPr>
                             <a:picLocks noChangeArrowheads="1" noChangeAspect="1"/>
                           </pic:cNvPicPr>
@@ -4193,13 +4193,13 @@
       </w:r>
     </w:p>
     <w:bookmarkEnd w:id="45"/>
-    <w:bookmarkStart w:id="49" w:name="open-research"/>
+    <w:bookmarkStart w:id="46" w:name="conflict-of-interest"/>
     <w:p>
       <w:pPr>
         <w:pStyle w:val="Heading2"/>
       </w:pPr>
       <w:r>
-        <w:t xml:space="preserve">Open research</w:t>
+        <w:t xml:space="preserve">Conflict of Interest</w:t>
       </w:r>
     </w:p>
     <w:p>
@@ -4207,12 +4207,30 @@
         <w:pStyle w:val="FirstParagraph"/>
       </w:pPr>
       <w:r>
+        <w:t xml:space="preserve">The authors declare no conflicts of interest relevant to this study.</w:t>
+      </w:r>
+    </w:p>
+    <w:bookmarkEnd w:id="46"/>
+    <w:bookmarkStart w:id="48" w:name="availability-statement"/>
+    <w:p>
+      <w:pPr>
+        <w:pStyle w:val="Heading2"/>
+      </w:pPr>
+      <w:r>
+        <w:t xml:space="preserve">Availability Statement</w:t>
+      </w:r>
+    </w:p>
+    <w:p>
+      <w:pPr>
+        <w:pStyle w:val="FirstParagraph"/>
+      </w:pPr>
+      <w:r>
         <w:t xml:space="preserve">The CMIP6 data used in the manuscript is publicly available at the Earth System Grid Federation</w:t>
       </w:r>
       <w:r>
         <w:t xml:space="preserve"> </w:t>
       </w:r>
-      <w:hyperlink r:id="rId46">
+      <w:hyperlink r:id="rId47">
         <w:r>
           <w:rPr>
             <w:rStyle w:val="Hyperlink"/>
@@ -4221,12 +4239,1088 @@
         </w:r>
       </w:hyperlink>
       <w:r>
-        <w:t xml:space="preserve">. A version-controlled repository of the code used to create this analysis, including the necessary code to download the derived data can be found at</w:t>
-      </w:r>
-      <w:r>
-        <w:t xml:space="preserve"> </w:t>
-      </w:r>
-      <w:hyperlink r:id="rId47">
+        <w:t xml:space="preserve">. A version-controlled repository of the code used to create this analysis, including the necessary code to download the derived data has been deposited in Zenodo</w:t>
+      </w:r>
+      <w:r>
+        <w:t xml:space="preserve"> </w:t>
+      </w:r>
+      <w:r>
+        <w:t xml:space="preserve">(Corrales 2026a)</w:t>
+      </w:r>
+      <w:r>
+        <w:t xml:space="preserve">. The derived data that support the findings of this study are also openly available in Zenodo</w:t>
+      </w:r>
+      <w:r>
+        <w:t xml:space="preserve"> </w:t>
+      </w:r>
+      <w:r>
+        <w:t xml:space="preserve">(Corrales 2026b)</w:t>
+      </w:r>
+      <w:r>
+        <w:t xml:space="preserve">.</w:t>
+      </w:r>
+    </w:p>
+    <w:bookmarkEnd w:id="48"/>
+    <w:bookmarkStart w:id="150" w:name="references"/>
+    <w:p>
+      <w:pPr>
+        <w:pStyle w:val="Heading2"/>
+      </w:pPr>
+      <w:r>
+        <w:t xml:space="preserve">References</w:t>
+      </w:r>
+    </w:p>
+    <w:bookmarkStart w:id="149" w:name="refs"/>
+    <w:bookmarkStart w:id="50" w:name="ref-quarto"/>
+    <w:p>
+      <w:pPr>
+        <w:pStyle w:val="Bibliography"/>
+      </w:pPr>
+      <w:r>
+        <w:t xml:space="preserve">Allaire, J. J., Charles Teague, Carlos Scheidegger, Yihui Xie, Christophe Dervieux, and Gordon Woodhull. 2025.</w:t>
+      </w:r>
+      <w:r>
+        <w:t xml:space="preserve"> </w:t>
+      </w:r>
+      <w:r>
+        <w:t xml:space="preserve">“</w:t>
+      </w:r>
+      <w:r>
+        <w:t xml:space="preserve">Quarto</w:t>
+      </w:r>
+      <w:r>
+        <w:t xml:space="preserve">.”</w:t>
+      </w:r>
+      <w:r>
+        <w:t xml:space="preserve"> </w:t>
+      </w:r>
+      <w:hyperlink r:id="rId49">
+        <w:r>
+          <w:rPr>
+            <w:rStyle w:val="Hyperlink"/>
+          </w:rPr>
+          <w:t xml:space="preserve">https://doi.org/10.5281/zenodo.5960048</w:t>
+        </w:r>
+      </w:hyperlink>
+      <w:r>
+        <w:t xml:space="preserve">.</w:t>
+      </w:r>
+    </w:p>
+    <w:bookmarkEnd w:id="50"/>
+    <w:bookmarkStart w:id="51" w:name="ref-data.table"/>
+    <w:p>
+      <w:pPr>
+        <w:pStyle w:val="Bibliography"/>
+      </w:pPr>
+      <w:r>
+        <w:t xml:space="preserve">Barrett, Tyson, Matt Dowle, Arun Srinivasan, Jan Gorecki, Michael Chirico, Toby Hocking, Benjamin Schwendinger, and Ivan Krylov. 2025.</w:t>
+      </w:r>
+      <w:r>
+        <w:t xml:space="preserve"> </w:t>
+      </w:r>
+      <w:r>
+        <w:t xml:space="preserve">“Data.table: Extension of ‘Data.frame‘.”</w:t>
+      </w:r>
+    </w:p>
+    <w:bookmarkEnd w:id="51"/>
+    <w:bookmarkStart w:id="53" w:name="ref-Bentsen2019"/>
+    <w:p>
+      <w:pPr>
+        <w:pStyle w:val="Bibliography"/>
+      </w:pPr>
+      <w:r>
+        <w:t xml:space="preserve">Bentsen, Mats, Dirk Jan Leo Oliviè, Øyvind Seland, Thomas Toniazzo, Ada Gjermundsen, Lise Seland Graff, Jens Boldingh Debernard, et al. 2019a.</w:t>
+      </w:r>
+      <w:r>
+        <w:t xml:space="preserve"> </w:t>
+      </w:r>
+      <w:r>
+        <w:t xml:space="preserve">“</w:t>
+      </w:r>
+      <w:r>
+        <w:t xml:space="preserve">IPCC DDC</w:t>
+      </w:r>
+      <w:r>
+        <w:t xml:space="preserve">:</w:t>
+      </w:r>
+      <w:r>
+        <w:t xml:space="preserve"> </w:t>
+      </w:r>
+      <w:r>
+        <w:t xml:space="preserve">NCC NorESM2-MM</w:t>
+      </w:r>
+      <w:r>
+        <w:t xml:space="preserve"> </w:t>
+      </w:r>
+      <w:r>
+        <w:t xml:space="preserve">Model Output Prepared for</w:t>
+      </w:r>
+      <w:r>
+        <w:t xml:space="preserve"> </w:t>
+      </w:r>
+      <w:r>
+        <w:t xml:space="preserve">CMIP6 CMIP</w:t>
+      </w:r>
+      <w:r>
+        <w:t xml:space="preserve">.”</w:t>
+      </w:r>
+      <w:r>
+        <w:t xml:space="preserve"> </w:t>
+      </w:r>
+      <w:r>
+        <w:t xml:space="preserve">World Data Center for Climate (WDCC) at DKRZ.</w:t>
+      </w:r>
+      <w:r>
+        <w:t xml:space="preserve"> </w:t>
+      </w:r>
+      <w:hyperlink r:id="rId52">
+        <w:r>
+          <w:rPr>
+            <w:rStyle w:val="Hyperlink"/>
+          </w:rPr>
+          <w:t xml:space="preserve">https://doi.org/10.26050/WDCC/AR6.C6CMNCCN2</w:t>
+        </w:r>
+      </w:hyperlink>
+      <w:r>
+        <w:t xml:space="preserve">.</w:t>
+      </w:r>
+    </w:p>
+    <w:bookmarkEnd w:id="53"/>
+    <w:bookmarkStart w:id="55" w:name="ref-Bentsen2019a"/>
+    <w:p>
+      <w:pPr>
+        <w:pStyle w:val="Bibliography"/>
+      </w:pPr>
+      <w:r>
+        <w:t xml:space="preserve">———, et al. 2019b.</w:t>
+      </w:r>
+      <w:r>
+        <w:t xml:space="preserve"> </w:t>
+      </w:r>
+      <w:r>
+        <w:t xml:space="preserve">“</w:t>
+      </w:r>
+      <w:r>
+        <w:t xml:space="preserve">IPCC DDC</w:t>
+      </w:r>
+      <w:r>
+        <w:t xml:space="preserve">:</w:t>
+      </w:r>
+      <w:r>
+        <w:t xml:space="preserve"> </w:t>
+      </w:r>
+      <w:r>
+        <w:t xml:space="preserve">NCC NorESM2-MM</w:t>
+      </w:r>
+      <w:r>
+        <w:t xml:space="preserve"> </w:t>
+      </w:r>
+      <w:r>
+        <w:t xml:space="preserve">Model Output Prepared for</w:t>
+      </w:r>
+      <w:r>
+        <w:t xml:space="preserve"> </w:t>
+      </w:r>
+      <w:r>
+        <w:t xml:space="preserve">CMIP6 ScenarioMIP</w:t>
+      </w:r>
+      <w:r>
+        <w:t xml:space="preserve">.”</w:t>
+      </w:r>
+      <w:r>
+        <w:t xml:space="preserve"> </w:t>
+      </w:r>
+      <w:r>
+        <w:t xml:space="preserve">World Data Center for Climate (WDCC) at DKRZ.</w:t>
+      </w:r>
+      <w:r>
+        <w:t xml:space="preserve"> </w:t>
+      </w:r>
+      <w:hyperlink r:id="rId54">
+        <w:r>
+          <w:rPr>
+            <w:rStyle w:val="Hyperlink"/>
+          </w:rPr>
+          <w:t xml:space="preserve">https://doi.org/10.26050/WDCC/AR6.C6SPNCCN2</w:t>
+        </w:r>
+      </w:hyperlink>
+      <w:r>
+        <w:t xml:space="preserve">.</w:t>
+      </w:r>
+    </w:p>
+    <w:bookmarkEnd w:id="55"/>
+    <w:bookmarkStart w:id="57" w:name="ref-Berry2011"/>
+    <w:p>
+      <w:pPr>
+        <w:pStyle w:val="Bibliography"/>
+      </w:pPr>
+      <w:r>
+        <w:t xml:space="preserve">Berry, Gareth, Michael J. Reeder, and Christian Jakob. 2011.</w:t>
+      </w:r>
+      <w:r>
+        <w:t xml:space="preserve"> </w:t>
+      </w:r>
+      <w:r>
+        <w:t xml:space="preserve">“A Global Climatology of Atmospheric Fronts.”</w:t>
+      </w:r>
+      <w:r>
+        <w:t xml:space="preserve"> </w:t>
+      </w:r>
+      <w:r>
+        <w:rPr>
+          <w:i/>
+          <w:iCs/>
+        </w:rPr>
+        <w:t xml:space="preserve">Geophysical Research Letters</w:t>
+      </w:r>
+      <w:r>
+        <w:t xml:space="preserve"> </w:t>
+      </w:r>
+      <w:r>
+        <w:t xml:space="preserve">38 (4).</w:t>
+      </w:r>
+      <w:r>
+        <w:t xml:space="preserve"> </w:t>
+      </w:r>
+      <w:hyperlink r:id="rId56">
+        <w:r>
+          <w:rPr>
+            <w:rStyle w:val="Hyperlink"/>
+          </w:rPr>
+          <w:t xml:space="preserve">https://doi.org/10.1029/2010GL046451</w:t>
+        </w:r>
+      </w:hyperlink>
+      <w:r>
+        <w:t xml:space="preserve">.</w:t>
+      </w:r>
+    </w:p>
+    <w:bookmarkEnd w:id="57"/>
+    <w:bookmarkStart w:id="59" w:name="ref-Cai2022"/>
+    <w:p>
+      <w:pPr>
+        <w:pStyle w:val="Bibliography"/>
+      </w:pPr>
+      <w:r>
+        <w:t xml:space="preserve">Cai, Dejun, Nerilie J Abram, Jason J Sharples, and Sarah E Perkins-Kirkpatrick. 2022.</w:t>
+      </w:r>
+      <w:r>
+        <w:t xml:space="preserve"> </w:t>
+      </w:r>
+      <w:r>
+        <w:t xml:space="preserve">“Increasing Intensity and Frequency of Cold Fronts Contributed to</w:t>
+      </w:r>
+      <w:r>
+        <w:t xml:space="preserve"> </w:t>
+      </w:r>
+      <w:r>
+        <w:t xml:space="preserve">Australia</w:t>
+      </w:r>
+      <w:r>
+        <w:t xml:space="preserve">’s 2019–2020</w:t>
+      </w:r>
+      <w:r>
+        <w:t xml:space="preserve"> </w:t>
+      </w:r>
+      <w:r>
+        <w:t xml:space="preserve">Black Summer</w:t>
+      </w:r>
+      <w:r>
+        <w:t xml:space="preserve"> </w:t>
+      </w:r>
+      <w:r>
+        <w:t xml:space="preserve">Fire Disaster.”</w:t>
+      </w:r>
+      <w:r>
+        <w:t xml:space="preserve"> </w:t>
+      </w:r>
+      <w:r>
+        <w:rPr>
+          <w:i/>
+          <w:iCs/>
+        </w:rPr>
+        <w:t xml:space="preserve">Environmental Research Letters</w:t>
+      </w:r>
+      <w:r>
+        <w:t xml:space="preserve"> </w:t>
+      </w:r>
+      <w:r>
+        <w:t xml:space="preserve">17 (9): 094044.</w:t>
+      </w:r>
+      <w:r>
+        <w:t xml:space="preserve"> </w:t>
+      </w:r>
+      <w:hyperlink r:id="rId58">
+        <w:r>
+          <w:rPr>
+            <w:rStyle w:val="Hyperlink"/>
+          </w:rPr>
+          <w:t xml:space="preserve">https://doi.org/10.1088/1748-9326/ac8e88</w:t>
+        </w:r>
+      </w:hyperlink>
+      <w:r>
+        <w:t xml:space="preserve">.</w:t>
+      </w:r>
+    </w:p>
+    <w:bookmarkEnd w:id="59"/>
+    <w:bookmarkStart w:id="61" w:name="ref-metR"/>
+    <w:p>
+      <w:pPr>
+        <w:pStyle w:val="Bibliography"/>
+      </w:pPr>
+      <w:r>
+        <w:t xml:space="preserve">Campitelli, Elio. 2025a.</w:t>
+      </w:r>
+      <w:r>
+        <w:t xml:space="preserve"> </w:t>
+      </w:r>
+      <w:r>
+        <w:t xml:space="preserve">“metR: Tools for Easier Analysis of Meteorological Fields.”</w:t>
+      </w:r>
+      <w:r>
+        <w:t xml:space="preserve"> </w:t>
+      </w:r>
+      <w:hyperlink r:id="rId60">
+        <w:r>
+          <w:rPr>
+            <w:rStyle w:val="Hyperlink"/>
+          </w:rPr>
+          <w:t xml:space="preserve">https://doi.org/10.5281/zenodo.2593516</w:t>
+        </w:r>
+      </w:hyperlink>
+      <w:r>
+        <w:t xml:space="preserve">.</w:t>
+      </w:r>
+    </w:p>
+    <w:bookmarkEnd w:id="61"/>
+    <w:bookmarkStart w:id="63" w:name="ref-rcdo"/>
+    <w:p>
+      <w:pPr>
+        <w:pStyle w:val="Bibliography"/>
+      </w:pPr>
+      <w:r>
+        <w:t xml:space="preserve">———. 2025b.</w:t>
+      </w:r>
+      <w:r>
+        <w:t xml:space="preserve"> </w:t>
+      </w:r>
+      <w:r>
+        <w:t xml:space="preserve">“Rcdo: Create CDO Commands from r Functions.”</w:t>
+      </w:r>
+      <w:r>
+        <w:t xml:space="preserve"> </w:t>
+      </w:r>
+      <w:hyperlink r:id="rId62">
+        <w:r>
+          <w:rPr>
+            <w:rStyle w:val="Hyperlink"/>
+          </w:rPr>
+          <w:t xml:space="preserve">https://eliocamp.github.io/rcdo/</w:t>
+        </w:r>
+      </w:hyperlink>
+      <w:r>
+        <w:t xml:space="preserve">.</w:t>
+      </w:r>
+    </w:p>
+    <w:bookmarkEnd w:id="63"/>
+    <w:bookmarkStart w:id="65" w:name="ref-Catto2014"/>
+    <w:p>
+      <w:pPr>
+        <w:pStyle w:val="Bibliography"/>
+      </w:pPr>
+      <w:r>
+        <w:t xml:space="preserve">Catto, J. L., N. Nicholls, C. Jakob, and K. L. Shelton. 2014.</w:t>
+      </w:r>
+      <w:r>
+        <w:t xml:space="preserve"> </w:t>
+      </w:r>
+      <w:r>
+        <w:t xml:space="preserve">“Atmospheric Fronts in Current and Future Climates.”</w:t>
+      </w:r>
+      <w:r>
+        <w:t xml:space="preserve"> </w:t>
+      </w:r>
+      <w:r>
+        <w:rPr>
+          <w:i/>
+          <w:iCs/>
+        </w:rPr>
+        <w:t xml:space="preserve">Geophysical Research Letters</w:t>
+      </w:r>
+      <w:r>
+        <w:t xml:space="preserve"> </w:t>
+      </w:r>
+      <w:r>
+        <w:t xml:space="preserve">41 (21): 7642–50.</w:t>
+      </w:r>
+      <w:r>
+        <w:t xml:space="preserve"> </w:t>
+      </w:r>
+      <w:hyperlink r:id="rId64">
+        <w:r>
+          <w:rPr>
+            <w:rStyle w:val="Hyperlink"/>
+          </w:rPr>
+          <w:t xml:space="preserve">https://doi.org/10.1002/2014GL061943</w:t>
+        </w:r>
+      </w:hyperlink>
+      <w:r>
+        <w:t xml:space="preserve">.</w:t>
+      </w:r>
+    </w:p>
+    <w:bookmarkEnd w:id="65"/>
+    <w:bookmarkStart w:id="67" w:name="ref-Catto2013"/>
+    <w:p>
+      <w:pPr>
+        <w:pStyle w:val="Bibliography"/>
+      </w:pPr>
+      <w:r>
+        <w:t xml:space="preserve">Catto, J. L., and S. Pfahl. 2013.</w:t>
+      </w:r>
+      <w:r>
+        <w:t xml:space="preserve"> </w:t>
+      </w:r>
+      <w:r>
+        <w:t xml:space="preserve">“The Importance of Fronts for Extreme Precipitation.”</w:t>
+      </w:r>
+      <w:r>
+        <w:t xml:space="preserve"> </w:t>
+      </w:r>
+      <w:r>
+        <w:rPr>
+          <w:i/>
+          <w:iCs/>
+        </w:rPr>
+        <w:t xml:space="preserve">Journal of Geophysical Research: Atmospheres</w:t>
+      </w:r>
+      <w:r>
+        <w:t xml:space="preserve"> </w:t>
+      </w:r>
+      <w:r>
+        <w:t xml:space="preserve">118 (19): 10, 791–10, 801.</w:t>
+      </w:r>
+      <w:r>
+        <w:t xml:space="preserve"> </w:t>
+      </w:r>
+      <w:hyperlink r:id="rId66">
+        <w:r>
+          <w:rPr>
+            <w:rStyle w:val="Hyperlink"/>
+          </w:rPr>
+          <w:t xml:space="preserve">https://doi.org/10.1002/jgrd.50852</w:t>
+        </w:r>
+      </w:hyperlink>
+      <w:r>
+        <w:t xml:space="preserve">.</w:t>
+      </w:r>
+    </w:p>
+    <w:bookmarkEnd w:id="67"/>
+    <w:bookmarkStart w:id="69" w:name="ref-Chemke2022"/>
+    <w:p>
+      <w:pPr>
+        <w:pStyle w:val="Bibliography"/>
+      </w:pPr>
+      <w:r>
+        <w:t xml:space="preserve">Chemke, Rei. 2022.</w:t>
+      </w:r>
+      <w:r>
+        <w:t xml:space="preserve"> </w:t>
+      </w:r>
+      <w:r>
+        <w:t xml:space="preserve">“The Future Poleward Shift of</w:t>
+      </w:r>
+      <w:r>
+        <w:t xml:space="preserve"> </w:t>
+      </w:r>
+      <w:r>
+        <w:t xml:space="preserve">Southern Hemisphere</w:t>
+      </w:r>
+      <w:r>
+        <w:t xml:space="preserve"> </w:t>
+      </w:r>
+      <w:r>
+        <w:t xml:space="preserve">Summer Mid-Latitude Storm Tracks Stems from Ocean Coupling.”</w:t>
+      </w:r>
+      <w:r>
+        <w:t xml:space="preserve"> </w:t>
+      </w:r>
+      <w:r>
+        <w:rPr>
+          <w:i/>
+          <w:iCs/>
+        </w:rPr>
+        <w:t xml:space="preserve">Nature Communications</w:t>
+      </w:r>
+      <w:r>
+        <w:t xml:space="preserve"> </w:t>
+      </w:r>
+      <w:r>
+        <w:t xml:space="preserve">13 (1): 1730.</w:t>
+      </w:r>
+      <w:r>
+        <w:t xml:space="preserve"> </w:t>
+      </w:r>
+      <w:hyperlink r:id="rId68">
+        <w:r>
+          <w:rPr>
+            <w:rStyle w:val="Hyperlink"/>
+          </w:rPr>
+          <w:t xml:space="preserve">https://doi.org/10.1038/s41467-022-29392-4</w:t>
+        </w:r>
+      </w:hyperlink>
+      <w:r>
+        <w:t xml:space="preserve">.</w:t>
+      </w:r>
+    </w:p>
+    <w:bookmarkEnd w:id="69"/>
+    <w:bookmarkStart w:id="71" w:name="ref-ConsortiumEC-Earth2019"/>
+    <w:p>
+      <w:pPr>
+        <w:pStyle w:val="Bibliography"/>
+      </w:pPr>
+      <w:r>
+        <w:t xml:space="preserve">Consortium (EC-Earth), EC-Earth. 2019a.</w:t>
+      </w:r>
+      <w:r>
+        <w:t xml:space="preserve"> </w:t>
+      </w:r>
+      <w:r>
+        <w:t xml:space="preserve">“</w:t>
+      </w:r>
+      <w:r>
+        <w:t xml:space="preserve">IPCC DDC</w:t>
+      </w:r>
+      <w:r>
+        <w:t xml:space="preserve">:</w:t>
+      </w:r>
+      <w:r>
+        <w:t xml:space="preserve"> </w:t>
+      </w:r>
+      <w:r>
+        <w:t xml:space="preserve">EC-Earth-Consortium EC-Earth3</w:t>
+      </w:r>
+      <w:r>
+        <w:t xml:space="preserve"> </w:t>
+      </w:r>
+      <w:r>
+        <w:t xml:space="preserve">Model Output Prepared for</w:t>
+      </w:r>
+      <w:r>
+        <w:t xml:space="preserve"> </w:t>
+      </w:r>
+      <w:r>
+        <w:t xml:space="preserve">CMIP6 CMIP</w:t>
+      </w:r>
+      <w:r>
+        <w:t xml:space="preserve">.”</w:t>
+      </w:r>
+      <w:r>
+        <w:t xml:space="preserve"> </w:t>
+      </w:r>
+      <w:r>
+        <w:t xml:space="preserve">World Data Center for Climate (WDCC) at DKRZ.</w:t>
+      </w:r>
+      <w:r>
+        <w:t xml:space="preserve"> </w:t>
+      </w:r>
+      <w:hyperlink r:id="rId70">
+        <w:r>
+          <w:rPr>
+            <w:rStyle w:val="Hyperlink"/>
+          </w:rPr>
+          <w:t xml:space="preserve">https://doi.org/10.26050/WDCC/AR6.C6CMEEE3</w:t>
+        </w:r>
+      </w:hyperlink>
+      <w:r>
+        <w:t xml:space="preserve">.</w:t>
+      </w:r>
+    </w:p>
+    <w:bookmarkEnd w:id="71"/>
+    <w:bookmarkStart w:id="73" w:name="ref-ConsortiumEC-Earth2019b"/>
+    <w:p>
+      <w:pPr>
+        <w:pStyle w:val="Bibliography"/>
+      </w:pPr>
+      <w:r>
+        <w:t xml:space="preserve">———. 2019b.</w:t>
+      </w:r>
+      <w:r>
+        <w:t xml:space="preserve"> </w:t>
+      </w:r>
+      <w:r>
+        <w:t xml:space="preserve">“</w:t>
+      </w:r>
+      <w:r>
+        <w:t xml:space="preserve">IPCC DDC</w:t>
+      </w:r>
+      <w:r>
+        <w:t xml:space="preserve">:</w:t>
+      </w:r>
+      <w:r>
+        <w:t xml:space="preserve"> </w:t>
+      </w:r>
+      <w:r>
+        <w:t xml:space="preserve">EC-Earth-Consortium EC-Earth3-Veg</w:t>
+      </w:r>
+      <w:r>
+        <w:t xml:space="preserve"> </w:t>
+      </w:r>
+      <w:r>
+        <w:t xml:space="preserve">Model Output Prepared for</w:t>
+      </w:r>
+      <w:r>
+        <w:t xml:space="preserve"> </w:t>
+      </w:r>
+      <w:r>
+        <w:t xml:space="preserve">CMIP6 CMIP</w:t>
+      </w:r>
+      <w:r>
+        <w:t xml:space="preserve">.”</w:t>
+      </w:r>
+      <w:r>
+        <w:t xml:space="preserve"> </w:t>
+      </w:r>
+      <w:r>
+        <w:t xml:space="preserve">World Data Center for Climate (WDCC) at DKRZ.</w:t>
+      </w:r>
+      <w:r>
+        <w:t xml:space="preserve"> </w:t>
+      </w:r>
+      <w:hyperlink r:id="rId72">
+        <w:r>
+          <w:rPr>
+            <w:rStyle w:val="Hyperlink"/>
+          </w:rPr>
+          <w:t xml:space="preserve">https://doi.org/10.26050/WDCC/AR6.C6CMEEEVE</w:t>
+        </w:r>
+      </w:hyperlink>
+      <w:r>
+        <w:t xml:space="preserve">.</w:t>
+      </w:r>
+    </w:p>
+    <w:bookmarkEnd w:id="73"/>
+    <w:bookmarkStart w:id="75" w:name="ref-ConsortiumEC-Earth2019a"/>
+    <w:p>
+      <w:pPr>
+        <w:pStyle w:val="Bibliography"/>
+      </w:pPr>
+      <w:r>
+        <w:t xml:space="preserve">———. 2019c.</w:t>
+      </w:r>
+      <w:r>
+        <w:t xml:space="preserve"> </w:t>
+      </w:r>
+      <w:r>
+        <w:t xml:space="preserve">“</w:t>
+      </w:r>
+      <w:r>
+        <w:t xml:space="preserve">IPCC DDC</w:t>
+      </w:r>
+      <w:r>
+        <w:t xml:space="preserve">:</w:t>
+      </w:r>
+      <w:r>
+        <w:t xml:space="preserve"> </w:t>
+      </w:r>
+      <w:r>
+        <w:t xml:space="preserve">EC-Earth-Consortium EC-Earth3</w:t>
+      </w:r>
+      <w:r>
+        <w:t xml:space="preserve"> </w:t>
+      </w:r>
+      <w:r>
+        <w:t xml:space="preserve">Model Output Prepared for</w:t>
+      </w:r>
+      <w:r>
+        <w:t xml:space="preserve"> </w:t>
+      </w:r>
+      <w:r>
+        <w:t xml:space="preserve">CMIP6 ScenarioMIP</w:t>
+      </w:r>
+      <w:r>
+        <w:t xml:space="preserve">.”</w:t>
+      </w:r>
+      <w:r>
+        <w:t xml:space="preserve"> </w:t>
+      </w:r>
+      <w:r>
+        <w:t xml:space="preserve">World Data Center for Climate (WDCC) at DKRZ.</w:t>
+      </w:r>
+      <w:r>
+        <w:t xml:space="preserve"> </w:t>
+      </w:r>
+      <w:hyperlink r:id="rId74">
+        <w:r>
+          <w:rPr>
+            <w:rStyle w:val="Hyperlink"/>
+          </w:rPr>
+          <w:t xml:space="preserve">https://doi.org/10.26050/WDCC/AR6.C6SPEEE3</w:t>
+        </w:r>
+      </w:hyperlink>
+      <w:r>
+        <w:t xml:space="preserve">.</w:t>
+      </w:r>
+    </w:p>
+    <w:bookmarkEnd w:id="75"/>
+    <w:bookmarkStart w:id="77" w:name="ref-ConsortiumEC-Earth2019c"/>
+    <w:p>
+      <w:pPr>
+        <w:pStyle w:val="Bibliography"/>
+      </w:pPr>
+      <w:r>
+        <w:t xml:space="preserve">———. 2019d.</w:t>
+      </w:r>
+      <w:r>
+        <w:t xml:space="preserve"> </w:t>
+      </w:r>
+      <w:r>
+        <w:t xml:space="preserve">“</w:t>
+      </w:r>
+      <w:r>
+        <w:t xml:space="preserve">IPCC DDC</w:t>
+      </w:r>
+      <w:r>
+        <w:t xml:space="preserve">:</w:t>
+      </w:r>
+      <w:r>
+        <w:t xml:space="preserve"> </w:t>
+      </w:r>
+      <w:r>
+        <w:t xml:space="preserve">EC-Earth-Consortium EC-Earth3-Veg</w:t>
+      </w:r>
+      <w:r>
+        <w:t xml:space="preserve"> </w:t>
+      </w:r>
+      <w:r>
+        <w:t xml:space="preserve">Model Output Prepared for</w:t>
+      </w:r>
+      <w:r>
+        <w:t xml:space="preserve"> </w:t>
+      </w:r>
+      <w:r>
+        <w:t xml:space="preserve">CMIP6 ScenarioMIP</w:t>
+      </w:r>
+      <w:r>
+        <w:t xml:space="preserve">.”</w:t>
+      </w:r>
+      <w:r>
+        <w:t xml:space="preserve"> </w:t>
+      </w:r>
+      <w:r>
+        <w:t xml:space="preserve">World Data Center for Climate (WDCC) at DKRZ.</w:t>
+      </w:r>
+      <w:r>
+        <w:t xml:space="preserve"> </w:t>
+      </w:r>
+      <w:hyperlink r:id="rId76">
+        <w:r>
+          <w:rPr>
+            <w:rStyle w:val="Hyperlink"/>
+          </w:rPr>
+          <w:t xml:space="preserve">https://doi.org/10.26050/WDCC/AR6.C6SPEEEVE</w:t>
+        </w:r>
+      </w:hyperlink>
+      <w:r>
+        <w:t xml:space="preserve">.</w:t>
+      </w:r>
+    </w:p>
+    <w:bookmarkEnd w:id="77"/>
+    <w:bookmarkStart w:id="79" w:name="ref-ConsortiumEC-Earth2020a"/>
+    <w:p>
+      <w:pPr>
+        <w:pStyle w:val="Bibliography"/>
+      </w:pPr>
+      <w:r>
+        <w:t xml:space="preserve">———. 2020a.</w:t>
+      </w:r>
+      <w:r>
+        <w:t xml:space="preserve"> </w:t>
+      </w:r>
+      <w:r>
+        <w:t xml:space="preserve">“</w:t>
+      </w:r>
+      <w:r>
+        <w:t xml:space="preserve">IPCC DDC</w:t>
+      </w:r>
+      <w:r>
+        <w:t xml:space="preserve">:</w:t>
+      </w:r>
+      <w:r>
+        <w:t xml:space="preserve"> </w:t>
+      </w:r>
+      <w:r>
+        <w:t xml:space="preserve">EC-Earth-Consortium EC-Earth3-Veg-LR</w:t>
+      </w:r>
+      <w:r>
+        <w:t xml:space="preserve"> </w:t>
+      </w:r>
+      <w:r>
+        <w:t xml:space="preserve">Model Output Prepared for</w:t>
+      </w:r>
+      <w:r>
+        <w:t xml:space="preserve"> </w:t>
+      </w:r>
+      <w:r>
+        <w:t xml:space="preserve">CMIP6 CMIP</w:t>
+      </w:r>
+      <w:r>
+        <w:t xml:space="preserve">.”</w:t>
+      </w:r>
+      <w:r>
+        <w:t xml:space="preserve"> </w:t>
+      </w:r>
+      <w:r>
+        <w:t xml:space="preserve">World Data Center for Climate (WDCC) at DKRZ.</w:t>
+      </w:r>
+      <w:r>
+        <w:t xml:space="preserve"> </w:t>
+      </w:r>
+      <w:hyperlink r:id="rId78">
+        <w:r>
+          <w:rPr>
+            <w:rStyle w:val="Hyperlink"/>
+          </w:rPr>
+          <w:t xml:space="preserve">https://doi.org/10.26050/WDCC/AR6.C6CMEEEVL</w:t>
+        </w:r>
+      </w:hyperlink>
+      <w:r>
+        <w:t xml:space="preserve">.</w:t>
+      </w:r>
+    </w:p>
+    <w:bookmarkEnd w:id="79"/>
+    <w:bookmarkStart w:id="81" w:name="ref-ConsortiumEC-Earth2020"/>
+    <w:p>
+      <w:pPr>
+        <w:pStyle w:val="Bibliography"/>
+      </w:pPr>
+      <w:r>
+        <w:t xml:space="preserve">———. 2020b.</w:t>
+      </w:r>
+      <w:r>
+        <w:t xml:space="preserve"> </w:t>
+      </w:r>
+      <w:r>
+        <w:t xml:space="preserve">“</w:t>
+      </w:r>
+      <w:r>
+        <w:t xml:space="preserve">IPCC DDC</w:t>
+      </w:r>
+      <w:r>
+        <w:t xml:space="preserve">:</w:t>
+      </w:r>
+      <w:r>
+        <w:t xml:space="preserve"> </w:t>
+      </w:r>
+      <w:r>
+        <w:t xml:space="preserve">EC-Earth-Consortium EC-Earth-3-CC</w:t>
+      </w:r>
+      <w:r>
+        <w:t xml:space="preserve"> </w:t>
+      </w:r>
+      <w:r>
+        <w:t xml:space="preserve">Model Output Prepared for</w:t>
+      </w:r>
+      <w:r>
+        <w:t xml:space="preserve"> </w:t>
+      </w:r>
+      <w:r>
+        <w:t xml:space="preserve">CMIP6 CMIP</w:t>
+      </w:r>
+      <w:r>
+        <w:t xml:space="preserve">.”</w:t>
+      </w:r>
+      <w:r>
+        <w:t xml:space="preserve"> </w:t>
+      </w:r>
+      <w:r>
+        <w:t xml:space="preserve">World Data Center for Climate (WDCC) at DKRZ.</w:t>
+      </w:r>
+      <w:r>
+        <w:t xml:space="preserve"> </w:t>
+      </w:r>
+      <w:hyperlink r:id="rId80">
+        <w:r>
+          <w:rPr>
+            <w:rStyle w:val="Hyperlink"/>
+          </w:rPr>
+          <w:t xml:space="preserve">https://doi.org/10.26050/WDCC/AR6.C6CMEEEEC</w:t>
+        </w:r>
+      </w:hyperlink>
+      <w:r>
+        <w:t xml:space="preserve">.</w:t>
+      </w:r>
+    </w:p>
+    <w:bookmarkEnd w:id="81"/>
+    <w:bookmarkStart w:id="83" w:name="ref-ConsortiumEC-Earth2021"/>
+    <w:p>
+      <w:pPr>
+        <w:pStyle w:val="Bibliography"/>
+      </w:pPr>
+      <w:r>
+        <w:t xml:space="preserve">———. 2021.</w:t>
+      </w:r>
+      <w:r>
+        <w:t xml:space="preserve"> </w:t>
+      </w:r>
+      <w:r>
+        <w:t xml:space="preserve">“</w:t>
+      </w:r>
+      <w:r>
+        <w:t xml:space="preserve">IPCC DDC</w:t>
+      </w:r>
+      <w:r>
+        <w:t xml:space="preserve">:</w:t>
+      </w:r>
+      <w:r>
+        <w:t xml:space="preserve"> </w:t>
+      </w:r>
+      <w:r>
+        <w:t xml:space="preserve">EC-Earth-Consortium EC-Earth3-CC</w:t>
+      </w:r>
+      <w:r>
+        <w:t xml:space="preserve"> </w:t>
+      </w:r>
+      <w:r>
+        <w:t xml:space="preserve">Model Output Prepared for</w:t>
+      </w:r>
+      <w:r>
+        <w:t xml:space="preserve"> </w:t>
+      </w:r>
+      <w:r>
+        <w:t xml:space="preserve">CMIP6 ScenarioMIP</w:t>
+      </w:r>
+      <w:r>
+        <w:t xml:space="preserve">.”</w:t>
+      </w:r>
+      <w:r>
+        <w:t xml:space="preserve"> </w:t>
+      </w:r>
+      <w:r>
+        <w:t xml:space="preserve">World Data Center for Climate (WDCC) at DKRZ.</w:t>
+      </w:r>
+      <w:r>
+        <w:t xml:space="preserve"> </w:t>
+      </w:r>
+      <w:hyperlink r:id="rId82">
+        <w:r>
+          <w:rPr>
+            <w:rStyle w:val="Hyperlink"/>
+          </w:rPr>
+          <w:t xml:space="preserve">https://doi.org/10.26050/WDCC/AR6.C6SPEEEEC</w:t>
+        </w:r>
+      </w:hyperlink>
+      <w:r>
+        <w:t xml:space="preserve">.</w:t>
+      </w:r>
+    </w:p>
+    <w:bookmarkEnd w:id="83"/>
+    <w:bookmarkStart w:id="85" w:name="ref-ConsortiumEC-Earth2023"/>
+    <w:p>
+      <w:pPr>
+        <w:pStyle w:val="Bibliography"/>
+      </w:pPr>
+      <w:r>
+        <w:t xml:space="preserve">———. 2023.</w:t>
+      </w:r>
+      <w:r>
+        <w:t xml:space="preserve"> </w:t>
+      </w:r>
+      <w:r>
+        <w:t xml:space="preserve">“</w:t>
+      </w:r>
+      <w:r>
+        <w:t xml:space="preserve">IPCC DDC</w:t>
+      </w:r>
+      <w:r>
+        <w:t xml:space="preserve">:</w:t>
+      </w:r>
+      <w:r>
+        <w:t xml:space="preserve"> </w:t>
+      </w:r>
+      <w:r>
+        <w:t xml:space="preserve">EC-Earth-Consortium EC-Earth3-Veg-LR</w:t>
+      </w:r>
+      <w:r>
+        <w:t xml:space="preserve"> </w:t>
+      </w:r>
+      <w:r>
+        <w:t xml:space="preserve">Model Output Prepared for</w:t>
+      </w:r>
+      <w:r>
+        <w:t xml:space="preserve"> </w:t>
+      </w:r>
+      <w:r>
+        <w:t xml:space="preserve">CMIP6 ScenarioMIP</w:t>
+      </w:r>
+      <w:r>
+        <w:t xml:space="preserve">.”</w:t>
+      </w:r>
+      <w:r>
+        <w:t xml:space="preserve"> </w:t>
+      </w:r>
+      <w:r>
+        <w:t xml:space="preserve">World Data Center for Climate (WDCC) at DKRZ.</w:t>
+      </w:r>
+      <w:r>
+        <w:t xml:space="preserve"> </w:t>
+      </w:r>
+      <w:hyperlink r:id="rId84">
+        <w:r>
+          <w:rPr>
+            <w:rStyle w:val="Hyperlink"/>
+          </w:rPr>
+          <w:t xml:space="preserve">https://doi.org/10.26050/WDCC/AR6.C6SPEEEVL</w:t>
+        </w:r>
+      </w:hyperlink>
+      <w:r>
+        <w:t xml:space="preserve">.</w:t>
+      </w:r>
+    </w:p>
+    <w:bookmarkEnd w:id="85"/>
+    <w:bookmarkStart w:id="87" w:name="ref-Corrales2026"/>
+    <w:p>
+      <w:pPr>
+        <w:pStyle w:val="Bibliography"/>
+      </w:pPr>
+      <w:r>
+        <w:t xml:space="preserve">Corrales, Paola. 2026a.</w:t>
+      </w:r>
+      <w:r>
+        <w:t xml:space="preserve"> </w:t>
+      </w:r>
+      <w:r>
+        <w:t xml:space="preserve">“Code Associated with "</w:t>
+      </w:r>
+      <w:r>
+        <w:t xml:space="preserve">Using</w:t>
+      </w:r>
+      <w:r>
+        <w:t xml:space="preserve"> </w:t>
+      </w:r>
+      <w:r>
+        <w:t xml:space="preserve">Rapid Temperature Falls to Estimate Future Strong Cold Front Frequency in</w:t>
+      </w:r>
+      <w:r>
+        <w:t xml:space="preserve"> </w:t>
+      </w:r>
+      <w:r>
+        <w:t xml:space="preserve">CMIP6</w:t>
+      </w:r>
+      <w:r>
+        <w:t xml:space="preserve"> </w:t>
+      </w:r>
+      <w:r>
+        <w:t xml:space="preserve">Climate Projections (Version V1.0) [Software]".”</w:t>
+      </w:r>
+      <w:r>
+        <w:t xml:space="preserve"> </w:t>
+      </w:r>
+      <w:r>
+        <w:t xml:space="preserve">Zenodo.</w:t>
+      </w:r>
+      <w:r>
+        <w:t xml:space="preserve"> </w:t>
+      </w:r>
+      <w:hyperlink r:id="rId86">
         <w:r>
           <w:rPr>
             <w:rStyle w:val="Hyperlink"/>
@@ -4235,12 +5329,58 @@
         </w:r>
       </w:hyperlink>
       <w:r>
-        <w:t xml:space="preserve">. The derived data that support the findings of this study are also openly available in Zenodo at</w:t>
-      </w:r>
-      <w:r>
-        <w:t xml:space="preserve"> </w:t>
-      </w:r>
-      <w:hyperlink r:id="rId48">
+        <w:t xml:space="preserve">.</w:t>
+      </w:r>
+    </w:p>
+    <w:bookmarkEnd w:id="87"/>
+    <w:bookmarkStart w:id="89" w:name="ref-Corrales2026a"/>
+    <w:p>
+      <w:pPr>
+        <w:pStyle w:val="Bibliography"/>
+      </w:pPr>
+      <w:r>
+        <w:t xml:space="preserve">———. 2026b.</w:t>
+      </w:r>
+      <w:r>
+        <w:t xml:space="preserve"> </w:t>
+      </w:r>
+      <w:r>
+        <w:t xml:space="preserve">“Derived Data for</w:t>
+      </w:r>
+      <w:r>
+        <w:t xml:space="preserve"> </w:t>
+      </w:r>
+      <w:r>
+        <w:t xml:space="preserve">Using</w:t>
+      </w:r>
+      <w:r>
+        <w:t xml:space="preserve"> </w:t>
+      </w:r>
+      <w:r>
+        <w:t xml:space="preserve">Rapid Temperature Falls to Estimate Future Strong Cold Front Frequency in</w:t>
+      </w:r>
+      <w:r>
+        <w:t xml:space="preserve"> </w:t>
+      </w:r>
+      <w:r>
+        <w:t xml:space="preserve">CMIP6</w:t>
+      </w:r>
+      <w:r>
+        <w:t xml:space="preserve"> </w:t>
+      </w:r>
+      <w:r>
+        <w:t xml:space="preserve">Climate Projections (Version V2).”</w:t>
+      </w:r>
+      <w:r>
+        <w:t xml:space="preserve"> </w:t>
+      </w:r>
+      <w:r>
+        <w:t xml:space="preserve">Zenodo.</w:t>
+      </w:r>
+      <w:r>
+        <w:t xml:space="preserve"> </w:t>
+      </w:r>
+      <w:hyperlink r:id="rId88">
         <w:r>
           <w:rPr>
             <w:rStyle w:val="Hyperlink"/>
@@ -4252,1023 +5392,8 @@
         <w:t xml:space="preserve">.</w:t>
       </w:r>
     </w:p>
-    <w:bookmarkEnd w:id="49"/>
-    <w:bookmarkStart w:id="147" w:name="references"/>
-    <w:p>
-      <w:pPr>
-        <w:pStyle w:val="Heading2"/>
-      </w:pPr>
-      <w:r>
-        <w:t xml:space="preserve">References</w:t>
-      </w:r>
-    </w:p>
-    <w:bookmarkStart w:id="146" w:name="refs"/>
-    <w:bookmarkStart w:id="51" w:name="ref-quarto"/>
-    <w:p>
-      <w:pPr>
-        <w:pStyle w:val="Bibliography"/>
-      </w:pPr>
-      <w:r>
-        <w:t xml:space="preserve">Allaire, J. J., Charles Teague, Carlos Scheidegger, Yihui Xie, Christophe Dervieux, and Gordon Woodhull. 2025.</w:t>
-      </w:r>
-      <w:r>
-        <w:t xml:space="preserve"> </w:t>
-      </w:r>
-      <w:r>
-        <w:t xml:space="preserve">“</w:t>
-      </w:r>
-      <w:r>
-        <w:t xml:space="preserve">Quarto</w:t>
-      </w:r>
-      <w:r>
-        <w:t xml:space="preserve">.”</w:t>
-      </w:r>
-      <w:r>
-        <w:t xml:space="preserve"> </w:t>
-      </w:r>
-      <w:hyperlink r:id="rId50">
-        <w:r>
-          <w:rPr>
-            <w:rStyle w:val="Hyperlink"/>
-          </w:rPr>
-          <w:t xml:space="preserve">https://doi.org/10.5281/zenodo.5960048</w:t>
-        </w:r>
-      </w:hyperlink>
-      <w:r>
-        <w:t xml:space="preserve">.</w:t>
-      </w:r>
-    </w:p>
-    <w:bookmarkEnd w:id="51"/>
-    <w:bookmarkStart w:id="52" w:name="ref-data.table"/>
-    <w:p>
-      <w:pPr>
-        <w:pStyle w:val="Bibliography"/>
-      </w:pPr>
-      <w:r>
-        <w:t xml:space="preserve">Barrett, Tyson, Matt Dowle, Arun Srinivasan, Jan Gorecki, Michael Chirico, Toby Hocking, Benjamin Schwendinger, and Ivan Krylov. 2025.</w:t>
-      </w:r>
-      <w:r>
-        <w:t xml:space="preserve"> </w:t>
-      </w:r>
-      <w:r>
-        <w:t xml:space="preserve">“Data.table: Extension of ‘Data.frame‘.”</w:t>
-      </w:r>
-    </w:p>
-    <w:bookmarkEnd w:id="52"/>
-    <w:bookmarkStart w:id="54" w:name="ref-Bentsen2019"/>
-    <w:p>
-      <w:pPr>
-        <w:pStyle w:val="Bibliography"/>
-      </w:pPr>
-      <w:r>
-        <w:t xml:space="preserve">Bentsen, Mats, Dirk Jan Leo Oliviè, Øyvind Seland, Thomas Toniazzo, Ada Gjermundsen, Lise Seland Graff, Jens Boldingh Debernard, et al. 2019a.</w:t>
-      </w:r>
-      <w:r>
-        <w:t xml:space="preserve"> </w:t>
-      </w:r>
-      <w:r>
-        <w:t xml:space="preserve">“</w:t>
-      </w:r>
-      <w:r>
-        <w:t xml:space="preserve">IPCC DDC</w:t>
-      </w:r>
-      <w:r>
-        <w:t xml:space="preserve">:</w:t>
-      </w:r>
-      <w:r>
-        <w:t xml:space="preserve"> </w:t>
-      </w:r>
-      <w:r>
-        <w:t xml:space="preserve">NCC NorESM2-MM</w:t>
-      </w:r>
-      <w:r>
-        <w:t xml:space="preserve"> </w:t>
-      </w:r>
-      <w:r>
-        <w:t xml:space="preserve">Model Output Prepared for</w:t>
-      </w:r>
-      <w:r>
-        <w:t xml:space="preserve"> </w:t>
-      </w:r>
-      <w:r>
-        <w:t xml:space="preserve">CMIP6 CMIP</w:t>
-      </w:r>
-      <w:r>
-        <w:t xml:space="preserve">.”</w:t>
-      </w:r>
-      <w:r>
-        <w:t xml:space="preserve"> </w:t>
-      </w:r>
-      <w:r>
-        <w:t xml:space="preserve">World Data Center for Climate (WDCC) at DKRZ.</w:t>
-      </w:r>
-      <w:r>
-        <w:t xml:space="preserve"> </w:t>
-      </w:r>
-      <w:hyperlink r:id="rId53">
-        <w:r>
-          <w:rPr>
-            <w:rStyle w:val="Hyperlink"/>
-          </w:rPr>
-          <w:t xml:space="preserve">https://doi.org/10.26050/WDCC/AR6.C6CMNCCN2</w:t>
-        </w:r>
-      </w:hyperlink>
-      <w:r>
-        <w:t xml:space="preserve">.</w:t>
-      </w:r>
-    </w:p>
-    <w:bookmarkEnd w:id="54"/>
-    <w:bookmarkStart w:id="56" w:name="ref-Bentsen2019a"/>
-    <w:p>
-      <w:pPr>
-        <w:pStyle w:val="Bibliography"/>
-      </w:pPr>
-      <w:r>
-        <w:t xml:space="preserve">———, et al. 2019b.</w:t>
-      </w:r>
-      <w:r>
-        <w:t xml:space="preserve"> </w:t>
-      </w:r>
-      <w:r>
-        <w:t xml:space="preserve">“</w:t>
-      </w:r>
-      <w:r>
-        <w:t xml:space="preserve">IPCC DDC</w:t>
-      </w:r>
-      <w:r>
-        <w:t xml:space="preserve">:</w:t>
-      </w:r>
-      <w:r>
-        <w:t xml:space="preserve"> </w:t>
-      </w:r>
-      <w:r>
-        <w:t xml:space="preserve">NCC NorESM2-MM</w:t>
-      </w:r>
-      <w:r>
-        <w:t xml:space="preserve"> </w:t>
-      </w:r>
-      <w:r>
-        <w:t xml:space="preserve">Model Output Prepared for</w:t>
-      </w:r>
-      <w:r>
-        <w:t xml:space="preserve"> </w:t>
-      </w:r>
-      <w:r>
-        <w:t xml:space="preserve">CMIP6 ScenarioMIP</w:t>
-      </w:r>
-      <w:r>
-        <w:t xml:space="preserve">.”</w:t>
-      </w:r>
-      <w:r>
-        <w:t xml:space="preserve"> </w:t>
-      </w:r>
-      <w:r>
-        <w:t xml:space="preserve">World Data Center for Climate (WDCC) at DKRZ.</w:t>
-      </w:r>
-      <w:r>
-        <w:t xml:space="preserve"> </w:t>
-      </w:r>
-      <w:hyperlink r:id="rId55">
-        <w:r>
-          <w:rPr>
-            <w:rStyle w:val="Hyperlink"/>
-          </w:rPr>
-          <w:t xml:space="preserve">https://doi.org/10.26050/WDCC/AR6.C6SPNCCN2</w:t>
-        </w:r>
-      </w:hyperlink>
-      <w:r>
-        <w:t xml:space="preserve">.</w:t>
-      </w:r>
-    </w:p>
-    <w:bookmarkEnd w:id="56"/>
-    <w:bookmarkStart w:id="58" w:name="ref-Berry2011"/>
-    <w:p>
-      <w:pPr>
-        <w:pStyle w:val="Bibliography"/>
-      </w:pPr>
-      <w:r>
-        <w:t xml:space="preserve">Berry, Gareth, Michael J. Reeder, and Christian Jakob. 2011.</w:t>
-      </w:r>
-      <w:r>
-        <w:t xml:space="preserve"> </w:t>
-      </w:r>
-      <w:r>
-        <w:t xml:space="preserve">“A Global Climatology of Atmospheric Fronts.”</w:t>
-      </w:r>
-      <w:r>
-        <w:t xml:space="preserve"> </w:t>
-      </w:r>
-      <w:r>
-        <w:rPr>
-          <w:i/>
-          <w:iCs/>
-        </w:rPr>
-        <w:t xml:space="preserve">Geophysical Research Letters</w:t>
-      </w:r>
-      <w:r>
-        <w:t xml:space="preserve"> </w:t>
-      </w:r>
-      <w:r>
-        <w:t xml:space="preserve">38 (4).</w:t>
-      </w:r>
-      <w:r>
-        <w:t xml:space="preserve"> </w:t>
-      </w:r>
-      <w:hyperlink r:id="rId57">
-        <w:r>
-          <w:rPr>
-            <w:rStyle w:val="Hyperlink"/>
-          </w:rPr>
-          <w:t xml:space="preserve">https://doi.org/10.1029/2010GL046451</w:t>
-        </w:r>
-      </w:hyperlink>
-      <w:r>
-        <w:t xml:space="preserve">.</w:t>
-      </w:r>
-    </w:p>
-    <w:bookmarkEnd w:id="58"/>
-    <w:bookmarkStart w:id="60" w:name="ref-Cai2022"/>
-    <w:p>
-      <w:pPr>
-        <w:pStyle w:val="Bibliography"/>
-      </w:pPr>
-      <w:r>
-        <w:t xml:space="preserve">Cai, Dejun, Nerilie J Abram, Jason J Sharples, and Sarah E Perkins-Kirkpatrick. 2022.</w:t>
-      </w:r>
-      <w:r>
-        <w:t xml:space="preserve"> </w:t>
-      </w:r>
-      <w:r>
-        <w:t xml:space="preserve">“Increasing Intensity and Frequency of Cold Fronts Contributed to</w:t>
-      </w:r>
-      <w:r>
-        <w:t xml:space="preserve"> </w:t>
-      </w:r>
-      <w:r>
-        <w:t xml:space="preserve">Australia</w:t>
-      </w:r>
-      <w:r>
-        <w:t xml:space="preserve">’s 2019–2020</w:t>
-      </w:r>
-      <w:r>
-        <w:t xml:space="preserve"> </w:t>
-      </w:r>
-      <w:r>
-        <w:t xml:space="preserve">Black Summer</w:t>
-      </w:r>
-      <w:r>
-        <w:t xml:space="preserve"> </w:t>
-      </w:r>
-      <w:r>
-        <w:t xml:space="preserve">Fire Disaster.”</w:t>
-      </w:r>
-      <w:r>
-        <w:t xml:space="preserve"> </w:t>
-      </w:r>
-      <w:r>
-        <w:rPr>
-          <w:i/>
-          <w:iCs/>
-        </w:rPr>
-        <w:t xml:space="preserve">Environmental Research Letters</w:t>
-      </w:r>
-      <w:r>
-        <w:t xml:space="preserve"> </w:t>
-      </w:r>
-      <w:r>
-        <w:t xml:space="preserve">17 (9): 094044.</w:t>
-      </w:r>
-      <w:r>
-        <w:t xml:space="preserve"> </w:t>
-      </w:r>
-      <w:hyperlink r:id="rId59">
-        <w:r>
-          <w:rPr>
-            <w:rStyle w:val="Hyperlink"/>
-          </w:rPr>
-          <w:t xml:space="preserve">https://doi.org/10.1088/1748-9326/ac8e88</w:t>
-        </w:r>
-      </w:hyperlink>
-      <w:r>
-        <w:t xml:space="preserve">.</w:t>
-      </w:r>
-    </w:p>
-    <w:bookmarkEnd w:id="60"/>
-    <w:bookmarkStart w:id="62" w:name="ref-metR"/>
-    <w:p>
-      <w:pPr>
-        <w:pStyle w:val="Bibliography"/>
-      </w:pPr>
-      <w:r>
-        <w:t xml:space="preserve">Campitelli, Elio. 2025a.</w:t>
-      </w:r>
-      <w:r>
-        <w:t xml:space="preserve"> </w:t>
-      </w:r>
-      <w:r>
-        <w:t xml:space="preserve">“metR: Tools for Easier Analysis of Meteorological Fields.”</w:t>
-      </w:r>
-      <w:r>
-        <w:t xml:space="preserve"> </w:t>
-      </w:r>
-      <w:hyperlink r:id="rId61">
-        <w:r>
-          <w:rPr>
-            <w:rStyle w:val="Hyperlink"/>
-          </w:rPr>
-          <w:t xml:space="preserve">https://doi.org/10.5281/zenodo.2593516</w:t>
-        </w:r>
-      </w:hyperlink>
-      <w:r>
-        <w:t xml:space="preserve">.</w:t>
-      </w:r>
-    </w:p>
-    <w:bookmarkEnd w:id="62"/>
-    <w:bookmarkStart w:id="64" w:name="ref-rcdo"/>
-    <w:p>
-      <w:pPr>
-        <w:pStyle w:val="Bibliography"/>
-      </w:pPr>
-      <w:r>
-        <w:t xml:space="preserve">———. 2025b.</w:t>
-      </w:r>
-      <w:r>
-        <w:t xml:space="preserve"> </w:t>
-      </w:r>
-      <w:r>
-        <w:t xml:space="preserve">“Rcdo: Create CDO Commands from r Functions.”</w:t>
-      </w:r>
-      <w:r>
-        <w:t xml:space="preserve"> </w:t>
-      </w:r>
-      <w:hyperlink r:id="rId63">
-        <w:r>
-          <w:rPr>
-            <w:rStyle w:val="Hyperlink"/>
-          </w:rPr>
-          <w:t xml:space="preserve">https://eliocamp.github.io/rcdo/</w:t>
-        </w:r>
-      </w:hyperlink>
-      <w:r>
-        <w:t xml:space="preserve">.</w:t>
-      </w:r>
-    </w:p>
-    <w:bookmarkEnd w:id="64"/>
-    <w:bookmarkStart w:id="66" w:name="ref-Catto2014"/>
-    <w:p>
-      <w:pPr>
-        <w:pStyle w:val="Bibliography"/>
-      </w:pPr>
-      <w:r>
-        <w:t xml:space="preserve">Catto, J. L., N. Nicholls, C. Jakob, and K. L. Shelton. 2014.</w:t>
-      </w:r>
-      <w:r>
-        <w:t xml:space="preserve"> </w:t>
-      </w:r>
-      <w:r>
-        <w:t xml:space="preserve">“Atmospheric Fronts in Current and Future Climates.”</w:t>
-      </w:r>
-      <w:r>
-        <w:t xml:space="preserve"> </w:t>
-      </w:r>
-      <w:r>
-        <w:rPr>
-          <w:i/>
-          <w:iCs/>
-        </w:rPr>
-        <w:t xml:space="preserve">Geophysical Research Letters</w:t>
-      </w:r>
-      <w:r>
-        <w:t xml:space="preserve"> </w:t>
-      </w:r>
-      <w:r>
-        <w:t xml:space="preserve">41 (21): 7642–50.</w:t>
-      </w:r>
-      <w:r>
-        <w:t xml:space="preserve"> </w:t>
-      </w:r>
-      <w:hyperlink r:id="rId65">
-        <w:r>
-          <w:rPr>
-            <w:rStyle w:val="Hyperlink"/>
-          </w:rPr>
-          <w:t xml:space="preserve">https://doi.org/10.1002/2014GL061943</w:t>
-        </w:r>
-      </w:hyperlink>
-      <w:r>
-        <w:t xml:space="preserve">.</w:t>
-      </w:r>
-    </w:p>
-    <w:bookmarkEnd w:id="66"/>
-    <w:bookmarkStart w:id="68" w:name="ref-Catto2013"/>
-    <w:p>
-      <w:pPr>
-        <w:pStyle w:val="Bibliography"/>
-      </w:pPr>
-      <w:r>
-        <w:t xml:space="preserve">Catto, J. L., and S. Pfahl. 2013.</w:t>
-      </w:r>
-      <w:r>
-        <w:t xml:space="preserve"> </w:t>
-      </w:r>
-      <w:r>
-        <w:t xml:space="preserve">“The Importance of Fronts for Extreme Precipitation.”</w:t>
-      </w:r>
-      <w:r>
-        <w:t xml:space="preserve"> </w:t>
-      </w:r>
-      <w:r>
-        <w:rPr>
-          <w:i/>
-          <w:iCs/>
-        </w:rPr>
-        <w:t xml:space="preserve">Journal of Geophysical Research: Atmospheres</w:t>
-      </w:r>
-      <w:r>
-        <w:t xml:space="preserve"> </w:t>
-      </w:r>
-      <w:r>
-        <w:t xml:space="preserve">118 (19): 10, 791–10, 801.</w:t>
-      </w:r>
-      <w:r>
-        <w:t xml:space="preserve"> </w:t>
-      </w:r>
-      <w:hyperlink r:id="rId67">
-        <w:r>
-          <w:rPr>
-            <w:rStyle w:val="Hyperlink"/>
-          </w:rPr>
-          <w:t xml:space="preserve">https://doi.org/10.1002/jgrd.50852</w:t>
-        </w:r>
-      </w:hyperlink>
-      <w:r>
-        <w:t xml:space="preserve">.</w:t>
-      </w:r>
-    </w:p>
-    <w:bookmarkEnd w:id="68"/>
-    <w:bookmarkStart w:id="70" w:name="ref-Chemke2022"/>
-    <w:p>
-      <w:pPr>
-        <w:pStyle w:val="Bibliography"/>
-      </w:pPr>
-      <w:r>
-        <w:t xml:space="preserve">Chemke, Rei. 2022.</w:t>
-      </w:r>
-      <w:r>
-        <w:t xml:space="preserve"> </w:t>
-      </w:r>
-      <w:r>
-        <w:t xml:space="preserve">“The Future Poleward Shift of</w:t>
-      </w:r>
-      <w:r>
-        <w:t xml:space="preserve"> </w:t>
-      </w:r>
-      <w:r>
-        <w:t xml:space="preserve">Southern Hemisphere</w:t>
-      </w:r>
-      <w:r>
-        <w:t xml:space="preserve"> </w:t>
-      </w:r>
-      <w:r>
-        <w:t xml:space="preserve">Summer Mid-Latitude Storm Tracks Stems from Ocean Coupling.”</w:t>
-      </w:r>
-      <w:r>
-        <w:t xml:space="preserve"> </w:t>
-      </w:r>
-      <w:r>
-        <w:rPr>
-          <w:i/>
-          <w:iCs/>
-        </w:rPr>
-        <w:t xml:space="preserve">Nature Communications</w:t>
-      </w:r>
-      <w:r>
-        <w:t xml:space="preserve"> </w:t>
-      </w:r>
-      <w:r>
-        <w:t xml:space="preserve">13 (1): 1730.</w:t>
-      </w:r>
-      <w:r>
-        <w:t xml:space="preserve"> </w:t>
-      </w:r>
-      <w:hyperlink r:id="rId69">
-        <w:r>
-          <w:rPr>
-            <w:rStyle w:val="Hyperlink"/>
-          </w:rPr>
-          <w:t xml:space="preserve">https://doi.org/10.1038/s41467-022-29392-4</w:t>
-        </w:r>
-      </w:hyperlink>
-      <w:r>
-        <w:t xml:space="preserve">.</w:t>
-      </w:r>
-    </w:p>
-    <w:bookmarkEnd w:id="70"/>
-    <w:bookmarkStart w:id="72" w:name="ref-ConsortiumEC-Earth2019"/>
-    <w:p>
-      <w:pPr>
-        <w:pStyle w:val="Bibliography"/>
-      </w:pPr>
-      <w:r>
-        <w:t xml:space="preserve">Consortium (EC-Earth), EC-Earth. 2019a.</w:t>
-      </w:r>
-      <w:r>
-        <w:t xml:space="preserve"> </w:t>
-      </w:r>
-      <w:r>
-        <w:t xml:space="preserve">“</w:t>
-      </w:r>
-      <w:r>
-        <w:t xml:space="preserve">IPCC DDC</w:t>
-      </w:r>
-      <w:r>
-        <w:t xml:space="preserve">:</w:t>
-      </w:r>
-      <w:r>
-        <w:t xml:space="preserve"> </w:t>
-      </w:r>
-      <w:r>
-        <w:t xml:space="preserve">EC-Earth-Consortium EC-Earth3</w:t>
-      </w:r>
-      <w:r>
-        <w:t xml:space="preserve"> </w:t>
-      </w:r>
-      <w:r>
-        <w:t xml:space="preserve">Model Output Prepared for</w:t>
-      </w:r>
-      <w:r>
-        <w:t xml:space="preserve"> </w:t>
-      </w:r>
-      <w:r>
-        <w:t xml:space="preserve">CMIP6 CMIP</w:t>
-      </w:r>
-      <w:r>
-        <w:t xml:space="preserve">.”</w:t>
-      </w:r>
-      <w:r>
-        <w:t xml:space="preserve"> </w:t>
-      </w:r>
-      <w:r>
-        <w:t xml:space="preserve">World Data Center for Climate (WDCC) at DKRZ.</w:t>
-      </w:r>
-      <w:r>
-        <w:t xml:space="preserve"> </w:t>
-      </w:r>
-      <w:hyperlink r:id="rId71">
-        <w:r>
-          <w:rPr>
-            <w:rStyle w:val="Hyperlink"/>
-          </w:rPr>
-          <w:t xml:space="preserve">https://doi.org/10.26050/WDCC/AR6.C6CMEEE3</w:t>
-        </w:r>
-      </w:hyperlink>
-      <w:r>
-        <w:t xml:space="preserve">.</w:t>
-      </w:r>
-    </w:p>
-    <w:bookmarkEnd w:id="72"/>
-    <w:bookmarkStart w:id="74" w:name="ref-ConsortiumEC-Earth2019b"/>
-    <w:p>
-      <w:pPr>
-        <w:pStyle w:val="Bibliography"/>
-      </w:pPr>
-      <w:r>
-        <w:t xml:space="preserve">———. 2019b.</w:t>
-      </w:r>
-      <w:r>
-        <w:t xml:space="preserve"> </w:t>
-      </w:r>
-      <w:r>
-        <w:t xml:space="preserve">“</w:t>
-      </w:r>
-      <w:r>
-        <w:t xml:space="preserve">IPCC DDC</w:t>
-      </w:r>
-      <w:r>
-        <w:t xml:space="preserve">:</w:t>
-      </w:r>
-      <w:r>
-        <w:t xml:space="preserve"> </w:t>
-      </w:r>
-      <w:r>
-        <w:t xml:space="preserve">EC-Earth-Consortium EC-Earth3-Veg</w:t>
-      </w:r>
-      <w:r>
-        <w:t xml:space="preserve"> </w:t>
-      </w:r>
-      <w:r>
-        <w:t xml:space="preserve">Model Output Prepared for</w:t>
-      </w:r>
-      <w:r>
-        <w:t xml:space="preserve"> </w:t>
-      </w:r>
-      <w:r>
-        <w:t xml:space="preserve">CMIP6 CMIP</w:t>
-      </w:r>
-      <w:r>
-        <w:t xml:space="preserve">.”</w:t>
-      </w:r>
-      <w:r>
-        <w:t xml:space="preserve"> </w:t>
-      </w:r>
-      <w:r>
-        <w:t xml:space="preserve">World Data Center for Climate (WDCC) at DKRZ.</w:t>
-      </w:r>
-      <w:r>
-        <w:t xml:space="preserve"> </w:t>
-      </w:r>
-      <w:hyperlink r:id="rId73">
-        <w:r>
-          <w:rPr>
-            <w:rStyle w:val="Hyperlink"/>
-          </w:rPr>
-          <w:t xml:space="preserve">https://doi.org/10.26050/WDCC/AR6.C6CMEEEVE</w:t>
-        </w:r>
-      </w:hyperlink>
-      <w:r>
-        <w:t xml:space="preserve">.</w:t>
-      </w:r>
-    </w:p>
-    <w:bookmarkEnd w:id="74"/>
-    <w:bookmarkStart w:id="76" w:name="ref-ConsortiumEC-Earth2019a"/>
-    <w:p>
-      <w:pPr>
-        <w:pStyle w:val="Bibliography"/>
-      </w:pPr>
-      <w:r>
-        <w:t xml:space="preserve">———. 2019c.</w:t>
-      </w:r>
-      <w:r>
-        <w:t xml:space="preserve"> </w:t>
-      </w:r>
-      <w:r>
-        <w:t xml:space="preserve">“</w:t>
-      </w:r>
-      <w:r>
-        <w:t xml:space="preserve">IPCC DDC</w:t>
-      </w:r>
-      <w:r>
-        <w:t xml:space="preserve">:</w:t>
-      </w:r>
-      <w:r>
-        <w:t xml:space="preserve"> </w:t>
-      </w:r>
-      <w:r>
-        <w:t xml:space="preserve">EC-Earth-Consortium EC-Earth3</w:t>
-      </w:r>
-      <w:r>
-        <w:t xml:space="preserve"> </w:t>
-      </w:r>
-      <w:r>
-        <w:t xml:space="preserve">Model Output Prepared for</w:t>
-      </w:r>
-      <w:r>
-        <w:t xml:space="preserve"> </w:t>
-      </w:r>
-      <w:r>
-        <w:t xml:space="preserve">CMIP6 ScenarioMIP</w:t>
-      </w:r>
-      <w:r>
-        <w:t xml:space="preserve">.”</w:t>
-      </w:r>
-      <w:r>
-        <w:t xml:space="preserve"> </w:t>
-      </w:r>
-      <w:r>
-        <w:t xml:space="preserve">World Data Center for Climate (WDCC) at DKRZ.</w:t>
-      </w:r>
-      <w:r>
-        <w:t xml:space="preserve"> </w:t>
-      </w:r>
-      <w:hyperlink r:id="rId75">
-        <w:r>
-          <w:rPr>
-            <w:rStyle w:val="Hyperlink"/>
-          </w:rPr>
-          <w:t xml:space="preserve">https://doi.org/10.26050/WDCC/AR6.C6SPEEE3</w:t>
-        </w:r>
-      </w:hyperlink>
-      <w:r>
-        <w:t xml:space="preserve">.</w:t>
-      </w:r>
-    </w:p>
-    <w:bookmarkEnd w:id="76"/>
-    <w:bookmarkStart w:id="78" w:name="ref-ConsortiumEC-Earth2019c"/>
-    <w:p>
-      <w:pPr>
-        <w:pStyle w:val="Bibliography"/>
-      </w:pPr>
-      <w:r>
-        <w:t xml:space="preserve">———. 2019d.</w:t>
-      </w:r>
-      <w:r>
-        <w:t xml:space="preserve"> </w:t>
-      </w:r>
-      <w:r>
-        <w:t xml:space="preserve">“</w:t>
-      </w:r>
-      <w:r>
-        <w:t xml:space="preserve">IPCC DDC</w:t>
-      </w:r>
-      <w:r>
-        <w:t xml:space="preserve">:</w:t>
-      </w:r>
-      <w:r>
-        <w:t xml:space="preserve"> </w:t>
-      </w:r>
-      <w:r>
-        <w:t xml:space="preserve">EC-Earth-Consortium EC-Earth3-Veg</w:t>
-      </w:r>
-      <w:r>
-        <w:t xml:space="preserve"> </w:t>
-      </w:r>
-      <w:r>
-        <w:t xml:space="preserve">Model Output Prepared for</w:t>
-      </w:r>
-      <w:r>
-        <w:t xml:space="preserve"> </w:t>
-      </w:r>
-      <w:r>
-        <w:t xml:space="preserve">CMIP6 ScenarioMIP</w:t>
-      </w:r>
-      <w:r>
-        <w:t xml:space="preserve">.”</w:t>
-      </w:r>
-      <w:r>
-        <w:t xml:space="preserve"> </w:t>
-      </w:r>
-      <w:r>
-        <w:t xml:space="preserve">World Data Center for Climate (WDCC) at DKRZ.</w:t>
-      </w:r>
-      <w:r>
-        <w:t xml:space="preserve"> </w:t>
-      </w:r>
-      <w:hyperlink r:id="rId77">
-        <w:r>
-          <w:rPr>
-            <w:rStyle w:val="Hyperlink"/>
-          </w:rPr>
-          <w:t xml:space="preserve">https://doi.org/10.26050/WDCC/AR6.C6SPEEEVE</w:t>
-        </w:r>
-      </w:hyperlink>
-      <w:r>
-        <w:t xml:space="preserve">.</w:t>
-      </w:r>
-    </w:p>
-    <w:bookmarkEnd w:id="78"/>
-    <w:bookmarkStart w:id="80" w:name="ref-ConsortiumEC-Earth2020a"/>
-    <w:p>
-      <w:pPr>
-        <w:pStyle w:val="Bibliography"/>
-      </w:pPr>
-      <w:r>
-        <w:t xml:space="preserve">———. 2020a.</w:t>
-      </w:r>
-      <w:r>
-        <w:t xml:space="preserve"> </w:t>
-      </w:r>
-      <w:r>
-        <w:t xml:space="preserve">“</w:t>
-      </w:r>
-      <w:r>
-        <w:t xml:space="preserve">IPCC DDC</w:t>
-      </w:r>
-      <w:r>
-        <w:t xml:space="preserve">:</w:t>
-      </w:r>
-      <w:r>
-        <w:t xml:space="preserve"> </w:t>
-      </w:r>
-      <w:r>
-        <w:t xml:space="preserve">EC-Earth-Consortium EC-Earth3-Veg-LR</w:t>
-      </w:r>
-      <w:r>
-        <w:t xml:space="preserve"> </w:t>
-      </w:r>
-      <w:r>
-        <w:t xml:space="preserve">Model Output Prepared for</w:t>
-      </w:r>
-      <w:r>
-        <w:t xml:space="preserve"> </w:t>
-      </w:r>
-      <w:r>
-        <w:t xml:space="preserve">CMIP6 CMIP</w:t>
-      </w:r>
-      <w:r>
-        <w:t xml:space="preserve">.”</w:t>
-      </w:r>
-      <w:r>
-        <w:t xml:space="preserve"> </w:t>
-      </w:r>
-      <w:r>
-        <w:t xml:space="preserve">World Data Center for Climate (WDCC) at DKRZ.</w:t>
-      </w:r>
-      <w:r>
-        <w:t xml:space="preserve"> </w:t>
-      </w:r>
-      <w:hyperlink r:id="rId79">
-        <w:r>
-          <w:rPr>
-            <w:rStyle w:val="Hyperlink"/>
-          </w:rPr>
-          <w:t xml:space="preserve">https://doi.org/10.26050/WDCC/AR6.C6CMEEEVL</w:t>
-        </w:r>
-      </w:hyperlink>
-      <w:r>
-        <w:t xml:space="preserve">.</w:t>
-      </w:r>
-    </w:p>
-    <w:bookmarkEnd w:id="80"/>
-    <w:bookmarkStart w:id="82" w:name="ref-ConsortiumEC-Earth2020"/>
-    <w:p>
-      <w:pPr>
-        <w:pStyle w:val="Bibliography"/>
-      </w:pPr>
-      <w:r>
-        <w:t xml:space="preserve">———. 2020b.</w:t>
-      </w:r>
-      <w:r>
-        <w:t xml:space="preserve"> </w:t>
-      </w:r>
-      <w:r>
-        <w:t xml:space="preserve">“</w:t>
-      </w:r>
-      <w:r>
-        <w:t xml:space="preserve">IPCC DDC</w:t>
-      </w:r>
-      <w:r>
-        <w:t xml:space="preserve">:</w:t>
-      </w:r>
-      <w:r>
-        <w:t xml:space="preserve"> </w:t>
-      </w:r>
-      <w:r>
-        <w:t xml:space="preserve">EC-Earth-Consortium EC-Earth-3-CC</w:t>
-      </w:r>
-      <w:r>
-        <w:t xml:space="preserve"> </w:t>
-      </w:r>
-      <w:r>
-        <w:t xml:space="preserve">Model Output Prepared for</w:t>
-      </w:r>
-      <w:r>
-        <w:t xml:space="preserve"> </w:t>
-      </w:r>
-      <w:r>
-        <w:t xml:space="preserve">CMIP6 CMIP</w:t>
-      </w:r>
-      <w:r>
-        <w:t xml:space="preserve">.”</w:t>
-      </w:r>
-      <w:r>
-        <w:t xml:space="preserve"> </w:t>
-      </w:r>
-      <w:r>
-        <w:t xml:space="preserve">World Data Center for Climate (WDCC) at DKRZ.</w:t>
-      </w:r>
-      <w:r>
-        <w:t xml:space="preserve"> </w:t>
-      </w:r>
-      <w:hyperlink r:id="rId81">
-        <w:r>
-          <w:rPr>
-            <w:rStyle w:val="Hyperlink"/>
-          </w:rPr>
-          <w:t xml:space="preserve">https://doi.org/10.26050/WDCC/AR6.C6CMEEEEC</w:t>
-        </w:r>
-      </w:hyperlink>
-      <w:r>
-        <w:t xml:space="preserve">.</w:t>
-      </w:r>
-    </w:p>
-    <w:bookmarkEnd w:id="82"/>
-    <w:bookmarkStart w:id="84" w:name="ref-ConsortiumEC-Earth2021"/>
-    <w:p>
-      <w:pPr>
-        <w:pStyle w:val="Bibliography"/>
-      </w:pPr>
-      <w:r>
-        <w:t xml:space="preserve">———. 2021.</w:t>
-      </w:r>
-      <w:r>
-        <w:t xml:space="preserve"> </w:t>
-      </w:r>
-      <w:r>
-        <w:t xml:space="preserve">“</w:t>
-      </w:r>
-      <w:r>
-        <w:t xml:space="preserve">IPCC DDC</w:t>
-      </w:r>
-      <w:r>
-        <w:t xml:space="preserve">:</w:t>
-      </w:r>
-      <w:r>
-        <w:t xml:space="preserve"> </w:t>
-      </w:r>
-      <w:r>
-        <w:t xml:space="preserve">EC-Earth-Consortium EC-Earth3-CC</w:t>
-      </w:r>
-      <w:r>
-        <w:t xml:space="preserve"> </w:t>
-      </w:r>
-      <w:r>
-        <w:t xml:space="preserve">Model Output Prepared for</w:t>
-      </w:r>
-      <w:r>
-        <w:t xml:space="preserve"> </w:t>
-      </w:r>
-      <w:r>
-        <w:t xml:space="preserve">CMIP6 ScenarioMIP</w:t>
-      </w:r>
-      <w:r>
-        <w:t xml:space="preserve">.”</w:t>
-      </w:r>
-      <w:r>
-        <w:t xml:space="preserve"> </w:t>
-      </w:r>
-      <w:r>
-        <w:t xml:space="preserve">World Data Center for Climate (WDCC) at DKRZ.</w:t>
-      </w:r>
-      <w:r>
-        <w:t xml:space="preserve"> </w:t>
-      </w:r>
-      <w:hyperlink r:id="rId83">
-        <w:r>
-          <w:rPr>
-            <w:rStyle w:val="Hyperlink"/>
-          </w:rPr>
-          <w:t xml:space="preserve">https://doi.org/10.26050/WDCC/AR6.C6SPEEEEC</w:t>
-        </w:r>
-      </w:hyperlink>
-      <w:r>
-        <w:t xml:space="preserve">.</w:t>
-      </w:r>
-    </w:p>
-    <w:bookmarkEnd w:id="84"/>
-    <w:bookmarkStart w:id="86" w:name="ref-ConsortiumEC-Earth2023"/>
-    <w:p>
-      <w:pPr>
-        <w:pStyle w:val="Bibliography"/>
-      </w:pPr>
-      <w:r>
-        <w:t xml:space="preserve">———. 2023.</w:t>
-      </w:r>
-      <w:r>
-        <w:t xml:space="preserve"> </w:t>
-      </w:r>
-      <w:r>
-        <w:t xml:space="preserve">“</w:t>
-      </w:r>
-      <w:r>
-        <w:t xml:space="preserve">IPCC DDC</w:t>
-      </w:r>
-      <w:r>
-        <w:t xml:space="preserve">:</w:t>
-      </w:r>
-      <w:r>
-        <w:t xml:space="preserve"> </w:t>
-      </w:r>
-      <w:r>
-        <w:t xml:space="preserve">EC-Earth-Consortium EC-Earth3-Veg-LR</w:t>
-      </w:r>
-      <w:r>
-        <w:t xml:space="preserve"> </w:t>
-      </w:r>
-      <w:r>
-        <w:t xml:space="preserve">Model Output Prepared for</w:t>
-      </w:r>
-      <w:r>
-        <w:t xml:space="preserve"> </w:t>
-      </w:r>
-      <w:r>
-        <w:t xml:space="preserve">CMIP6 ScenarioMIP</w:t>
-      </w:r>
-      <w:r>
-        <w:t xml:space="preserve">.”</w:t>
-      </w:r>
-      <w:r>
-        <w:t xml:space="preserve"> </w:t>
-      </w:r>
-      <w:r>
-        <w:t xml:space="preserve">World Data Center for Climate (WDCC) at DKRZ.</w:t>
-      </w:r>
-      <w:r>
-        <w:t xml:space="preserve"> </w:t>
-      </w:r>
-      <w:hyperlink r:id="rId85">
-        <w:r>
-          <w:rPr>
-            <w:rStyle w:val="Hyperlink"/>
-          </w:rPr>
-          <w:t xml:space="preserve">https://doi.org/10.26050/WDCC/AR6.C6SPEEEVL</w:t>
-        </w:r>
-      </w:hyperlink>
-      <w:r>
-        <w:t xml:space="preserve">.</w:t>
-      </w:r>
-    </w:p>
-    <w:bookmarkEnd w:id="86"/>
-    <w:bookmarkStart w:id="88" w:name="ref-Eyring2016"/>
+    <w:bookmarkEnd w:id="89"/>
+    <w:bookmarkStart w:id="91" w:name="ref-Eyring2016"/>
     <w:p>
       <w:pPr>
         <w:pStyle w:val="Bibliography"/>
@@ -5319,7 +5444,7 @@
       <w:r>
         <w:t xml:space="preserve"> </w:t>
       </w:r>
-      <w:hyperlink r:id="rId87">
+      <w:hyperlink r:id="rId90">
         <w:r>
           <w:rPr>
             <w:rStyle w:val="Hyperlink"/>
@@ -5331,8 +5456,8 @@
         <w:t xml:space="preserve">.</w:t>
       </w:r>
     </w:p>
-    <w:bookmarkEnd w:id="88"/>
-    <w:bookmarkStart w:id="90" w:name="ref-Guo2018a"/>
+    <w:bookmarkEnd w:id="91"/>
+    <w:bookmarkStart w:id="93" w:name="ref-Guo2018a"/>
     <w:p>
       <w:pPr>
         <w:pStyle w:val="Bibliography"/>
@@ -5382,7 +5507,7 @@
       <w:r>
         <w:t xml:space="preserve"> </w:t>
       </w:r>
-      <w:hyperlink r:id="rId89">
+      <w:hyperlink r:id="rId92">
         <w:r>
           <w:rPr>
             <w:rStyle w:val="Hyperlink"/>
@@ -5394,8 +5519,8 @@
         <w:t xml:space="preserve">.</w:t>
       </w:r>
     </w:p>
-    <w:bookmarkEnd w:id="90"/>
-    <w:bookmarkStart w:id="92" w:name="ref-Guo2018"/>
+    <w:bookmarkEnd w:id="93"/>
+    <w:bookmarkStart w:id="95" w:name="ref-Guo2018"/>
     <w:p>
       <w:pPr>
         <w:pStyle w:val="Bibliography"/>
@@ -5436,7 +5561,7 @@
       <w:r>
         <w:t xml:space="preserve"> </w:t>
       </w:r>
-      <w:hyperlink r:id="rId91">
+      <w:hyperlink r:id="rId94">
         <w:r>
           <w:rPr>
             <w:rStyle w:val="Hyperlink"/>
@@ -5448,8 +5573,8 @@
         <w:t xml:space="preserve">.</w:t>
       </w:r>
     </w:p>
-    <w:bookmarkEnd w:id="92"/>
-    <w:bookmarkStart w:id="94" w:name="ref-Harvey2014"/>
+    <w:bookmarkEnd w:id="95"/>
+    <w:bookmarkStart w:id="97" w:name="ref-Harvey2014"/>
     <w:p>
       <w:pPr>
         <w:pStyle w:val="Bibliography"/>
@@ -5494,7 +5619,7 @@
       <w:r>
         <w:t xml:space="preserve"> </w:t>
       </w:r>
-      <w:hyperlink r:id="rId93">
+      <w:hyperlink r:id="rId96">
         <w:r>
           <w:rPr>
             <w:rStyle w:val="Hyperlink"/>
@@ -5506,8 +5631,8 @@
         <w:t xml:space="preserve">.</w:t>
       </w:r>
     </w:p>
-    <w:bookmarkEnd w:id="94"/>
-    <w:bookmarkStart w:id="96" w:name="ref-Jungclaus2019"/>
+    <w:bookmarkEnd w:id="97"/>
+    <w:bookmarkStart w:id="99" w:name="ref-Jungclaus2019"/>
     <w:p>
       <w:pPr>
         <w:pStyle w:val="Bibliography"/>
@@ -5563,7 +5688,7 @@
       <w:r>
         <w:t xml:space="preserve"> </w:t>
       </w:r>
-      <w:hyperlink r:id="rId95">
+      <w:hyperlink r:id="rId98">
         <w:r>
           <w:rPr>
             <w:rStyle w:val="Hyperlink"/>
@@ -5575,8 +5700,8 @@
         <w:t xml:space="preserve">.</w:t>
       </w:r>
     </w:p>
-    <w:bookmarkEnd w:id="96"/>
-    <w:bookmarkStart w:id="98" w:name="ref-King2024"/>
+    <w:bookmarkEnd w:id="99"/>
+    <w:bookmarkStart w:id="101" w:name="ref-King2024"/>
     <w:p>
       <w:pPr>
         <w:pStyle w:val="Bibliography"/>
@@ -5621,7 +5746,7 @@
       <w:r>
         <w:t xml:space="preserve"> </w:t>
       </w:r>
-      <w:hyperlink r:id="rId97">
+      <w:hyperlink r:id="rId100">
         <w:r>
           <w:rPr>
             <w:rStyle w:val="Hyperlink"/>
@@ -5633,8 +5758,8 @@
         <w:t xml:space="preserve">.</w:t>
       </w:r>
     </w:p>
-    <w:bookmarkEnd w:id="98"/>
-    <w:bookmarkStart w:id="100" w:name="ref-Konstali2024"/>
+    <w:bookmarkEnd w:id="101"/>
+    <w:bookmarkStart w:id="103" w:name="ref-Konstali2024"/>
     <w:p>
       <w:pPr>
         <w:pStyle w:val="Bibliography"/>
@@ -5700,7 +5825,7 @@
       <w:r>
         <w:t xml:space="preserve"> </w:t>
       </w:r>
-      <w:hyperlink r:id="rId99">
+      <w:hyperlink r:id="rId102">
         <w:r>
           <w:rPr>
             <w:rStyle w:val="Hyperlink"/>
@@ -5712,8 +5837,8 @@
         <w:t xml:space="preserve">.</w:t>
       </w:r>
     </w:p>
-    <w:bookmarkEnd w:id="100"/>
-    <w:bookmarkStart w:id="102" w:name="ref-ggside"/>
+    <w:bookmarkEnd w:id="103"/>
+    <w:bookmarkStart w:id="105" w:name="ref-ggside"/>
     <w:p>
       <w:pPr>
         <w:pStyle w:val="Bibliography"/>
@@ -5730,7 +5855,7 @@
       <w:r>
         <w:t xml:space="preserve"> </w:t>
       </w:r>
-      <w:hyperlink r:id="rId101">
+      <w:hyperlink r:id="rId104">
         <w:r>
           <w:rPr>
             <w:rStyle w:val="Hyperlink"/>
@@ -5742,8 +5867,8 @@
         <w:t xml:space="preserve">.</w:t>
       </w:r>
     </w:p>
-    <w:bookmarkEnd w:id="102"/>
-    <w:bookmarkStart w:id="104" w:name="ref-Lovato2021"/>
+    <w:bookmarkEnd w:id="105"/>
+    <w:bookmarkStart w:id="107" w:name="ref-Lovato2021"/>
     <w:p>
       <w:pPr>
         <w:pStyle w:val="Bibliography"/>
@@ -5793,7 +5918,7 @@
       <w:r>
         <w:t xml:space="preserve"> </w:t>
       </w:r>
-      <w:hyperlink r:id="rId103">
+      <w:hyperlink r:id="rId106">
         <w:r>
           <w:rPr>
             <w:rStyle w:val="Hyperlink"/>
@@ -5805,8 +5930,8 @@
         <w:t xml:space="preserve">.</w:t>
       </w:r>
     </w:p>
-    <w:bookmarkEnd w:id="104"/>
-    <w:bookmarkStart w:id="106" w:name="ref-Lovato2021a"/>
+    <w:bookmarkEnd w:id="107"/>
+    <w:bookmarkStart w:id="109" w:name="ref-Lovato2021a"/>
     <w:p>
       <w:pPr>
         <w:pStyle w:val="Bibliography"/>
@@ -5856,7 +5981,7 @@
       <w:r>
         <w:t xml:space="preserve"> </w:t>
       </w:r>
-      <w:hyperlink r:id="rId105">
+      <w:hyperlink r:id="rId108">
         <w:r>
           <w:rPr>
             <w:rStyle w:val="Hyperlink"/>
@@ -5868,8 +5993,8 @@
         <w:t xml:space="preserve">.</w:t>
       </w:r>
     </w:p>
-    <w:bookmarkEnd w:id="106"/>
-    <w:bookmarkStart w:id="108" w:name="ref-Muir2010"/>
+    <w:bookmarkEnd w:id="109"/>
+    <w:bookmarkStart w:id="111" w:name="ref-Muir2010"/>
     <w:p>
       <w:pPr>
         <w:pStyle w:val="Bibliography"/>
@@ -5902,7 +6027,7 @@
       <w:r>
         <w:t xml:space="preserve"> </w:t>
       </w:r>
-      <w:hyperlink r:id="rId107">
+      <w:hyperlink r:id="rId110">
         <w:r>
           <w:rPr>
             <w:rStyle w:val="Hyperlink"/>
@@ -5914,8 +6039,8 @@
         <w:t xml:space="preserve">.</w:t>
       </w:r>
     </w:p>
-    <w:bookmarkEnd w:id="108"/>
-    <w:bookmarkStart w:id="110" w:name="ref-OGorman2010"/>
+    <w:bookmarkEnd w:id="111"/>
+    <w:bookmarkStart w:id="113" w:name="ref-OGorman2010"/>
     <w:p>
       <w:pPr>
         <w:pStyle w:val="Bibliography"/>
@@ -5948,7 +6073,7 @@
       <w:r>
         <w:t xml:space="preserve"> </w:t>
       </w:r>
-      <w:hyperlink r:id="rId109">
+      <w:hyperlink r:id="rId112">
         <w:r>
           <w:rPr>
             <w:rStyle w:val="Hyperlink"/>
@@ -5960,8 +6085,8 @@
         <w:t xml:space="preserve">.</w:t>
       </w:r>
     </w:p>
-    <w:bookmarkEnd w:id="110"/>
-    <w:bookmarkStart w:id="112" w:name="ref-ONeill2016"/>
+    <w:bookmarkEnd w:id="113"/>
+    <w:bookmarkStart w:id="115" w:name="ref-ONeill2016"/>
     <w:p>
       <w:pPr>
         <w:pStyle w:val="Bibliography"/>
@@ -6021,7 +6146,7 @@
       <w:r>
         <w:t xml:space="preserve"> </w:t>
       </w:r>
-      <w:hyperlink r:id="rId111">
+      <w:hyperlink r:id="rId114">
         <w:r>
           <w:rPr>
             <w:rStyle w:val="Hyperlink"/>
@@ -6033,8 +6158,8 @@
         <w:t xml:space="preserve">.</w:t>
       </w:r>
     </w:p>
-    <w:bookmarkEnd w:id="112"/>
-    <w:bookmarkStart w:id="114" w:name="ref-Parfitt2017"/>
+    <w:bookmarkEnd w:id="115"/>
+    <w:bookmarkStart w:id="117" w:name="ref-Parfitt2017"/>
     <w:p>
       <w:pPr>
         <w:pStyle w:val="Bibliography"/>
@@ -6103,7 +6228,7 @@
       <w:r>
         <w:t xml:space="preserve"> </w:t>
       </w:r>
-      <w:hyperlink r:id="rId113">
+      <w:hyperlink r:id="rId116">
         <w:r>
           <w:rPr>
             <w:rStyle w:val="Hyperlink"/>
@@ -6115,8 +6240,8 @@
         <w:t xml:space="preserve">.</w:t>
       </w:r>
     </w:p>
-    <w:bookmarkEnd w:id="114"/>
-    <w:bookmarkStart w:id="115" w:name="ref-patchwork"/>
+    <w:bookmarkEnd w:id="117"/>
+    <w:bookmarkStart w:id="118" w:name="ref-patchwork"/>
     <w:p>
       <w:pPr>
         <w:pStyle w:val="Bibliography"/>
@@ -6131,8 +6256,8 @@
         <w:t xml:space="preserve">“Patchwork: The Composer of Plots.”</w:t>
       </w:r>
     </w:p>
-    <w:bookmarkEnd w:id="115"/>
-    <w:bookmarkStart w:id="117" w:name="ref-Priestley2022"/>
+    <w:bookmarkEnd w:id="118"/>
+    <w:bookmarkStart w:id="120" w:name="ref-Priestley2022"/>
     <w:p>
       <w:pPr>
         <w:pStyle w:val="Bibliography"/>
@@ -6165,7 +6290,7 @@
       <w:r>
         <w:t xml:space="preserve"> </w:t>
       </w:r>
-      <w:hyperlink r:id="rId116">
+      <w:hyperlink r:id="rId119">
         <w:r>
           <w:rPr>
             <w:rStyle w:val="Hyperlink"/>
@@ -6177,8 +6302,8 @@
         <w:t xml:space="preserve">.</w:t>
       </w:r>
     </w:p>
-    <w:bookmarkEnd w:id="117"/>
-    <w:bookmarkStart w:id="119" w:name="ref-R"/>
+    <w:bookmarkEnd w:id="120"/>
+    <w:bookmarkStart w:id="122" w:name="ref-R"/>
     <w:p>
       <w:pPr>
         <w:pStyle w:val="Bibliography"/>
@@ -6201,7 +6326,7 @@
       <w:r>
         <w:t xml:space="preserve"> </w:t>
       </w:r>
-      <w:hyperlink r:id="rId118">
+      <w:hyperlink r:id="rId121">
         <w:r>
           <w:rPr>
             <w:rStyle w:val="Hyperlink"/>
@@ -6213,8 +6338,8 @@
         <w:t xml:space="preserve">.</w:t>
       </w:r>
     </w:p>
-    <w:bookmarkEnd w:id="119"/>
-    <w:bookmarkStart w:id="121" w:name="ref-Reeder2015"/>
+    <w:bookmarkEnd w:id="122"/>
+    <w:bookmarkStart w:id="124" w:name="ref-Reeder2015"/>
     <w:p>
       <w:pPr>
         <w:pStyle w:val="Bibliography"/>
@@ -6256,7 +6381,7 @@
       <w:r>
         <w:t xml:space="preserve"> </w:t>
       </w:r>
-      <w:hyperlink r:id="rId120">
+      <w:hyperlink r:id="rId123">
         <w:r>
           <w:rPr>
             <w:rStyle w:val="Hyperlink"/>
@@ -6268,8 +6393,8 @@
         <w:t xml:space="preserve">.</w:t>
       </w:r>
     </w:p>
-    <w:bookmarkEnd w:id="121"/>
-    <w:bookmarkStart w:id="123" w:name="ref-Reeder2021"/>
+    <w:bookmarkEnd w:id="124"/>
+    <w:bookmarkStart w:id="126" w:name="ref-Reeder2021"/>
     <w:p>
       <w:pPr>
         <w:pStyle w:val="Bibliography"/>
@@ -6335,7 +6460,7 @@
       <w:r>
         <w:t xml:space="preserve"> </w:t>
       </w:r>
-      <w:hyperlink r:id="rId122">
+      <w:hyperlink r:id="rId125">
         <w:r>
           <w:rPr>
             <w:rStyle w:val="Hyperlink"/>
@@ -6347,8 +6472,8 @@
         <w:t xml:space="preserve">.</w:t>
       </w:r>
     </w:p>
-    <w:bookmarkEnd w:id="123"/>
-    <w:bookmarkStart w:id="125" w:name="ref-Schneider2015"/>
+    <w:bookmarkEnd w:id="126"/>
+    <w:bookmarkStart w:id="128" w:name="ref-Schneider2015"/>
     <w:p>
       <w:pPr>
         <w:pStyle w:val="Bibliography"/>
@@ -6402,7 +6527,7 @@
       <w:r>
         <w:t xml:space="preserve"> </w:t>
       </w:r>
-      <w:hyperlink r:id="rId124">
+      <w:hyperlink r:id="rId127">
         <w:r>
           <w:rPr>
             <w:rStyle w:val="Hyperlink"/>
@@ -6414,8 +6539,8 @@
         <w:t xml:space="preserve">.</w:t>
       </w:r>
     </w:p>
-    <w:bookmarkEnd w:id="125"/>
-    <w:bookmarkStart w:id="127" w:name="ref-Schupfner2019"/>
+    <w:bookmarkEnd w:id="128"/>
+    <w:bookmarkStart w:id="130" w:name="ref-Schupfner2019"/>
     <w:p>
       <w:pPr>
         <w:pStyle w:val="Bibliography"/>
@@ -6471,7 +6596,7 @@
       <w:r>
         <w:t xml:space="preserve"> </w:t>
       </w:r>
-      <w:hyperlink r:id="rId126">
+      <w:hyperlink r:id="rId129">
         <w:r>
           <w:rPr>
             <w:rStyle w:val="Hyperlink"/>
@@ -6483,8 +6608,8 @@
         <w:t xml:space="preserve">.</w:t>
       </w:r>
     </w:p>
-    <w:bookmarkEnd w:id="127"/>
-    <w:bookmarkStart w:id="129" w:name="ref-Simmonds2012"/>
+    <w:bookmarkEnd w:id="130"/>
+    <w:bookmarkStart w:id="132" w:name="ref-Simmonds2012"/>
     <w:p>
       <w:pPr>
         <w:pStyle w:val="Bibliography"/>
@@ -6550,7 +6675,7 @@
       <w:r>
         <w:t xml:space="preserve"> </w:t>
       </w:r>
-      <w:hyperlink r:id="rId128">
+      <w:hyperlink r:id="rId131">
         <w:r>
           <w:rPr>
             <w:rStyle w:val="Hyperlink"/>
@@ -6562,8 +6687,8 @@
         <w:t xml:space="preserve">.</w:t>
       </w:r>
     </w:p>
-    <w:bookmarkEnd w:id="129"/>
-    <w:bookmarkStart w:id="131" w:name="ref-Tamarin2017"/>
+    <w:bookmarkEnd w:id="132"/>
+    <w:bookmarkStart w:id="134" w:name="ref-Tamarin2017"/>
     <w:p>
       <w:pPr>
         <w:pStyle w:val="Bibliography"/>
@@ -6608,7 +6733,7 @@
       <w:r>
         <w:t xml:space="preserve"> </w:t>
       </w:r>
-      <w:hyperlink r:id="rId130">
+      <w:hyperlink r:id="rId133">
         <w:r>
           <w:rPr>
             <w:rStyle w:val="Hyperlink"/>
@@ -6620,8 +6745,8 @@
         <w:t xml:space="preserve">.</w:t>
       </w:r>
     </w:p>
-    <w:bookmarkEnd w:id="131"/>
-    <w:bookmarkStart w:id="133" w:name="ref-Thomas2019"/>
+    <w:bookmarkEnd w:id="134"/>
+    <w:bookmarkStart w:id="136" w:name="ref-Thomas2019"/>
     <w:p>
       <w:pPr>
         <w:pStyle w:val="Bibliography"/>
@@ -6738,7 +6863,7 @@
       <w:r>
         <w:t xml:space="preserve"> </w:t>
       </w:r>
-      <w:hyperlink r:id="rId132">
+      <w:hyperlink r:id="rId135">
         <w:r>
           <w:rPr>
             <w:rStyle w:val="Hyperlink"/>
@@ -6750,8 +6875,8 @@
         <w:t xml:space="preserve">.</w:t>
       </w:r>
     </w:p>
-    <w:bookmarkEnd w:id="133"/>
-    <w:bookmarkStart w:id="135" w:name="ref-Volodin2019"/>
+    <w:bookmarkEnd w:id="136"/>
+    <w:bookmarkStart w:id="138" w:name="ref-Volodin2019"/>
     <w:p>
       <w:pPr>
         <w:pStyle w:val="Bibliography"/>
@@ -6795,7 +6920,7 @@
       <w:r>
         <w:t xml:space="preserve"> </w:t>
       </w:r>
-      <w:hyperlink r:id="rId134">
+      <w:hyperlink r:id="rId137">
         <w:r>
           <w:rPr>
             <w:rStyle w:val="Hyperlink"/>
@@ -6807,8 +6932,8 @@
         <w:t xml:space="preserve">.</w:t>
       </w:r>
     </w:p>
-    <w:bookmarkEnd w:id="135"/>
-    <w:bookmarkStart w:id="137" w:name="ref-Volodin2019a"/>
+    <w:bookmarkEnd w:id="138"/>
+    <w:bookmarkStart w:id="140" w:name="ref-Volodin2019a"/>
     <w:p>
       <w:pPr>
         <w:pStyle w:val="Bibliography"/>
@@ -6858,7 +6983,7 @@
       <w:r>
         <w:t xml:space="preserve"> </w:t>
       </w:r>
-      <w:hyperlink r:id="rId136">
+      <w:hyperlink r:id="rId139">
         <w:r>
           <w:rPr>
             <w:rStyle w:val="Hyperlink"/>
@@ -6870,8 +6995,8 @@
         <w:t xml:space="preserve">.</w:t>
       </w:r>
     </w:p>
-    <w:bookmarkEnd w:id="137"/>
-    <w:bookmarkStart w:id="139" w:name="ref-Volodin2019c"/>
+    <w:bookmarkEnd w:id="140"/>
+    <w:bookmarkStart w:id="142" w:name="ref-Volodin2019c"/>
     <w:p>
       <w:pPr>
         <w:pStyle w:val="Bibliography"/>
@@ -6921,7 +7046,7 @@
       <w:r>
         <w:t xml:space="preserve"> </w:t>
       </w:r>
-      <w:hyperlink r:id="rId138">
+      <w:hyperlink r:id="rId141">
         <w:r>
           <w:rPr>
             <w:rStyle w:val="Hyperlink"/>
@@ -6933,8 +7058,8 @@
         <w:t xml:space="preserve">.</w:t>
       </w:r>
     </w:p>
-    <w:bookmarkEnd w:id="139"/>
-    <w:bookmarkStart w:id="141" w:name="ref-Volodin2019b"/>
+    <w:bookmarkEnd w:id="142"/>
+    <w:bookmarkStart w:id="144" w:name="ref-Volodin2019b"/>
     <w:p>
       <w:pPr>
         <w:pStyle w:val="Bibliography"/>
@@ -6984,7 +7109,7 @@
       <w:r>
         <w:t xml:space="preserve"> </w:t>
       </w:r>
-      <w:hyperlink r:id="rId140">
+      <w:hyperlink r:id="rId143">
         <w:r>
           <w:rPr>
             <w:rStyle w:val="Hyperlink"/>
@@ -6996,8 +7121,8 @@
         <w:t xml:space="preserve">.</w:t>
       </w:r>
     </w:p>
-    <w:bookmarkEnd w:id="141"/>
-    <w:bookmarkStart w:id="143" w:name="ref-ggplot2"/>
+    <w:bookmarkEnd w:id="144"/>
+    <w:bookmarkStart w:id="146" w:name="ref-ggplot2"/>
     <w:p>
       <w:pPr>
         <w:pStyle w:val="Bibliography"/>
@@ -7020,7 +7145,7 @@
       <w:r>
         <w:t xml:space="preserve"> </w:t>
       </w:r>
-      <w:hyperlink r:id="rId142">
+      <w:hyperlink r:id="rId145">
         <w:r>
           <w:rPr>
             <w:rStyle w:val="Hyperlink"/>
@@ -7032,8 +7157,8 @@
         <w:t xml:space="preserve">.</w:t>
       </w:r>
     </w:p>
-    <w:bookmarkEnd w:id="143"/>
-    <w:bookmarkStart w:id="145" w:name="ref-cowplot"/>
+    <w:bookmarkEnd w:id="146"/>
+    <w:bookmarkStart w:id="148" w:name="ref-cowplot"/>
     <w:p>
       <w:pPr>
         <w:pStyle w:val="Bibliography"/>
@@ -7050,7 +7175,7 @@
       <w:r>
         <w:t xml:space="preserve"> </w:t>
       </w:r>
-      <w:hyperlink r:id="rId144">
+      <w:hyperlink r:id="rId147">
         <w:r>
           <w:rPr>
             <w:rStyle w:val="Hyperlink"/>
@@ -7062,9 +7187,9 @@
         <w:t xml:space="preserve">.</w:t>
       </w:r>
     </w:p>
-    <w:bookmarkEnd w:id="145"/>
-    <w:bookmarkEnd w:id="146"/>
-    <w:bookmarkEnd w:id="147"/>
+    <w:bookmarkEnd w:id="148"/>
+    <w:bookmarkEnd w:id="149"/>
+    <w:bookmarkEnd w:id="150"/>
     <w:sectPr>
       <w:footnotePr>
         <w:numRestart w:val="eachSect"/>

</xml_diff>